<commit_message>
ASE: fix post-edit findings (cross-reference, scope and hedges, captions), abstract 173 words, README numbering map, rebuild package
Co-Authored-By: Claude Opus 5.5 <noreply@anthropic.com>
Claude-Session: https://claude.ai/code/session_01LGLpDzAMfdMgWcXQjLxauw
</commit_message>
<xml_diff>
--- a/manuscript/ase/word/Manuscript_ASE.docx
+++ b/manuscript/ase/word/Manuscript_ASE.docx
@@ -90,7 +90,7 @@
         <w:pStyle w:val="FirstParagraph"/>
       </w:pPr>
       <w:r>
-        <w:t xml:space="preserve">On a continuous girder a channel’s influence line changes sign over the piers, so the area under a record, which gives the total load in influence-area weighing, can vanish. This paper gives criteria for choosing, before installation, channels that observe the total load. Closed forms give the blind loci of five channel types on continuous and haunched girders; strain gauges are blind at every zero of the uniform-load moment and nearly blind in a band that can contain gauges set back from the piers. Optimal sensors lie at the extremes of the uniform-load response, and the integral constant follows a linear-fractional (Möbius) law in the scaled pier stiffness. A laboratory test confirms the identity, and public moving-truck records are consistent with its assumptions; they also show that vehicle-free noise covariance misleads multi-channel weighting. On an in-service box girder, two static readings leave a side-span deflection constant uncertain by a factor of 6.6, whereas the main-span gauge is well determined, and a pier tiltmeter is the most informative additional measurement.</w:t>
+        <w:t xml:space="preserve">On a continuous girder the influence line of a channel changes sign over the piers, so the area under a record, which gives the total load in influence-area weighing, can vanish. This paper gives criteria for choosing, before installation, channels that observe the total load. Closed forms give the blind loci of five channel types on continuous and haunched girders; strain gauges are blind at every zero of the uniform-load moment and nearly blind in a band that can contain gauges set back from the piers. Optimal sensors lie at the extremes of the uniform-load response, and the constant follows a linear-fractional (Möbius) law in the scaled pier stiffness. A laboratory test confirms the identity. Public moving-truck records, whose reference weights vary too little to test weight discrimination, are consistent with its assumptions within margins of 10–27 % and show that vehicle-free noise covariance misleads multi-channel weighting. On an in-service box girder, two static readings leave a side-span deflection constant uncertain by a factor of 6.6, whereas the main-span constant is well determined.</w:t>
       </w:r>
     </w:p>
     <w:p>
@@ -150,7 +150,7 @@
         <w:pStyle w:val="BodyText"/>
       </w:pPr>
       <w:r>
-        <w:t xml:space="preserve">This paper supplies such criteria. Neither the influence-area identity nor the generalised least-squares (GLS) estimator is new; the contributions lie in the criteria built on them. (i) We derive a closed-form catalogue of blind loci for five channel types on two- and three-span and haunched girders, with two indicators that need no reference rigidity; strain influence lines cancel less than deflection influence lines (cancellation ratio</w:t>
+        <w:t xml:space="preserve">This paper supplies such criteria. Neither the influence-area identity nor the generalised least-squares (GLS) estimator is new; the contributions lie in the criteria built on them. (i) We derive a closed-form catalogue of blind loci for five channel types on two- and three-span and haunched girders, with two indicators that need no reference rigidity; at every prismatic location examined, strain influence lines cancel less than deflection influence lines (cancellation ratio</w:t>
       </w:r>
       <w:r>
         <w:t xml:space="preserve"> </w:t>
@@ -214,7 +214,7 @@
         <w:t xml:space="preserve"> </w:t>
       </w:r>
       <w:r>
-        <w:t xml:space="preserve">at mid-span of two equal spans), yet strain gauges are blind in every continuous girder. (ii) We derive a placement rule, optimal sensors at the extremes of the uniform-load response, and show on public moving-truck records that GLS weights built from vehicle-free noise raise the out-of-sample error above that of the gauge average (20.4 % against 11.9 % of gross weight). (iii) We show that the constant depends on pier stiffness through a linear-fractional (Möbius) law and, on an in-service box girder, that two static readings leave a side-span deflection constant uncertain by a factor of 6.6, while a pier tiltmeter would reduce the Cramér–Rao bound on its logarithm from 0.87 to 0.18.</w:t>
+        <w:t xml:space="preserve">at mid-span of two equal spans), yet strain gauges are blind in every continuous girder. (ii) We derive a placement rule, optimal sensors at the extremes of the uniform-load response, and show on one day of public moving-truck records that GLS weights built from vehicle-free noise raise the out-of-sample error above that of the gauge average (20.4 % against 11.9 % of gross weight). (iii) We show that the constant depends on pier stiffness through a linear-fractional (Möbius) law and, on an in-service box girder, that two static readings leave a side-span deflection constant uncertain by a factor of 6.6, while a pier tiltmeter would reduce the Cramér–Rao bound on its logarithm from 0.87 to 0.18.</w:t>
       </w:r>
     </w:p>
     <w:bookmarkEnd w:id="21"/>
@@ -6468,7 +6468,7 @@
         <w:t xml:space="preserve"> </w:t>
       </w:r>
       <w:r>
-        <w:t xml:space="preserve">near 1 indicates restraint rather than cancellation. At mid-span of two equal spans,</w:t>
+        <w:t xml:space="preserve">near 1 indicates restraint rather than cancellation. Strain influence lines cancel less than deflection influence lines at every prismatic location examined: at mid-span of two equal spans,</w:t>
       </w:r>
       <w:r>
         <w:t xml:space="preserve"> </w:t>
@@ -9776,7 +9776,7 @@
         <w:pStyle w:val="BodyText"/>
       </w:pPr>
       <w:r>
-        <w:t xml:space="preserve">Each lane needs its own constant. For the gauge average, return trips in lane B gave constants 0.79 times those of lane A (95 % CI 0.59–1.00), as on another continuous girder (Wu et al., 2020); lane-B speeds came from the lag between gauges, so this ratio also contains any difference between the two speed estimates. The lane effect is clearly resolved for one gauge only (st36: 0.64, 95 % CI 0.47–0.81). The two runs with the trucks one behind the other gave 0.92 of the summed single-truck predictions (pooled 95 % CI 0.77–1.06), consistent with superposition although both fall below the prediction.</w:t>
+        <w:t xml:space="preserve">Each lane needs its own constant. For the gauge average, return trips in lane B gave constants 0.79 times those of lane A (95 % CI 0.59–1.00), as on another continuous girder (Wu et al., 2020); lane-B speeds came from the lag between gauges, so this ratio also contains any difference between the two speed estimates. The lane effect is clearly resolved for one gauge only (st36: 0.64, 95 % CI 0.47–0.81). For the gauge average, the two runs with the trucks one behind the other gave 0.92 of the summed single-truck predictions (pooled 95 % CI 0.77–1.06), consistent with superposition although both fall below the prediction.</w:t>
       </w:r>
     </w:p>
     <w:p>
@@ -11911,7 +11911,7 @@
         <w:t xml:space="preserve"> </w:t>
       </w:r>
       <w:r>
-        <w:t xml:space="preserve">alone the best strain locations are 5–10 m from the piers (</w:t>
+        <w:t xml:space="preserve">alone the best strain locations in all haunched models are 5–10 m from the piers (</w:t>
       </w:r>
       <m:oMath>
         <m:d>
@@ -12192,7 +12192,7 @@
         </m:r>
       </m:oMath>
       <w:r>
-        <w:t xml:space="preserve">, calibration A), the standard deviation of the load falls from 24.8 % with N7 alone to 10.6 % with the pair, an upper bound because such common-mode behaviour need not hold during crossings (Section 4.3).</w:t>
+        <w:t xml:space="preserve">, calibration A), the standard deviation of the load falls from 24.8 % with N7 alone to 10.6 % with the pair; this gain is an upper bound, because such common-mode behaviour need not hold during crossings (Section 4.3).</w:t>
       </w:r>
     </w:p>
     <w:p>
@@ -12824,7 +12824,7 @@
         <w:t xml:space="preserve"> </w:t>
       </w:r>
       <w:r>
-        <w:t xml:space="preserve">mm biases a 25 t truck by 16–25 % at a single main-span gauge and by 41–271 % at a single side-span gauge (Supplementary Table S15). With present absolute-deflection technology, single-point integral weighing on a long-span girder is therefore marginal even at the best location, and non-contact techniques must establish their residual offset on site (Sohn, 2007; Cross et al., 2013). Speed enters through the response and its measurement: on lane A of the field records, speeds from a low-pass fit were 1.139 times those from the axle spikes (standard deviation 0.124, 22 runs), so the speed estimator alone can shift the weight by more than 10 %. The quasi-static error for a constant force is at most about 1 % when</w:t>
+        <w:t xml:space="preserve">mm biases a 25 t truck by 16–25 % at a single main-span gauge and by 41–271 % at a single side-span gauge (Supplementary Table S15). With present absolute-deflection technology, single-point integral weighing on a long-span girder is therefore marginal even at the best location, and non-contact techniques must establish their residual offset on site, because environmental effects act over the same window (Sohn, 2007; Cross et al., 2013). Speed enters through the response and its measurement: on lane A of the field records, speeds from a low-pass fit were 1.139 times those from the axle spikes (standard deviation 0.124, 22 runs), so the speed estimator alone can shift the weight by more than 10 %. The quasi-static error for a constant force crossing the laboratory beam is at most about 1 % when</w:t>
       </w:r>
       <w:r>
         <w:t xml:space="preserve"> </w:t>
@@ -12883,7 +12883,7 @@
         <w:t xml:space="preserve"> </w:t>
       </w:r>
       <w:r>
-        <w:t xml:space="preserve">(crossing time over fundamental period; Frýba, 1999); other terms are in Supplementary Section S10. The method is therefore proposed for preliminary overload screening, with the threshold set with a margin below the legal limit and the design live loads (CEN, 2003; AASHTO, 2024) and instrumented BWIM for flagged vehicles; influence-line BWIM does not suffer the blindness of Table 1, because it fits the whole record shape.</w:t>
+        <w:t xml:space="preserve">(crossing time over fundamental period; Frýba, 1999); the bound omits vehicle–bridge interaction and road roughness (Supplementary Sections S9 and S10). The method is therefore proposed for preliminary overload screening, with the threshold set with a margin below the legal limit and the design live loads (CEN, 2003; AASHTO, 2024) and instrumented BWIM for flagged vehicles; influence-line BWIM does not suffer the blindness of Table 1, because it fits the whole record shape.</w:t>
       </w:r>
     </w:p>
     <w:p>
@@ -13158,7 +13158,7 @@
         <w:pStyle w:val="BodyText"/>
       </w:pPr>
       <w:r>
-        <w:t xml:space="preserve">A residual offset of 0.1 mm biases a 25 t truck by 16–25 % even at mid main span.</w:t>
+        <w:t xml:space="preserve">On that girder, with a 200 m record, a residual offset of 0.1 mm would bias a 25 t truck by 16–25 % even at mid main span.</w:t>
       </w:r>
     </w:p>
     <w:p>
@@ -13759,40 +13759,12 @@
         <w:t xml:space="preserve"> </w:t>
       </w:r>
       <w:r>
-        <w:t xml:space="preserve">Continuous beams considered: (a) two-span beam with span ratio</w:t>
-      </w:r>
-      <w:r>
-        <w:t xml:space="preserve"> </w:t>
-      </w:r>
-      <m:oMath>
-        <m:r>
-          <m:t>λ</m:t>
-        </m:r>
-      </m:oMath>
-      <w:r>
-        <w:t xml:space="preserve">, rigidity ratio</w:t>
-      </w:r>
-      <w:r>
-        <w:t xml:space="preserve"> </w:t>
-      </w:r>
-      <m:oMath>
-        <m:r>
-          <m:t>γ</m:t>
-        </m:r>
-      </m:oMath>
-      <w:r>
-        <w:t xml:space="preserve"> </w:t>
-      </w:r>
-      <w:r>
-        <w:t xml:space="preserve">and sensor at</w:t>
-      </w:r>
-      <w:r>
-        <w:t xml:space="preserve"> </w:t>
-      </w:r>
-      <m:oMath>
-        <m:r>
-          <m:t>ξ</m:t>
-        </m:r>
+        <w:t xml:space="preserve">Continuous beams considered: (a) two-span beam with instrumented span</w:t>
+      </w:r>
+      <w:r>
+        <w:t xml:space="preserve"> </w:t>
+      </w:r>
+      <m:oMath>
         <m:sSub>
           <m:e>
             <m:r>
@@ -13807,32 +13779,410 @@
         </m:sSub>
       </m:oMath>
       <w:r>
-        <w:t xml:space="preserve">; (b) symmetric three-span beam with span ratio</w:t>
-      </w:r>
-      <w:r>
-        <w:t xml:space="preserve"> </w:t>
-      </w:r>
-      <m:oMath>
+        <w:t xml:space="preserve"> </w:t>
+      </w:r>
+      <w:r>
+        <w:t xml:space="preserve">of rigidity</w:t>
+      </w:r>
+      <w:r>
+        <w:t xml:space="preserve"> </w:t>
+      </w:r>
+      <m:oMath>
+        <m:r>
+          <m:t>E</m:t>
+        </m:r>
+        <m:sSub>
+          <m:e>
+            <m:r>
+              <m:t>I</m:t>
+            </m:r>
+          </m:e>
+          <m:sub>
+            <m:r>
+              <m:t>1</m:t>
+            </m:r>
+          </m:sub>
+        </m:sSub>
+      </m:oMath>
+      <w:r>
+        <w:t xml:space="preserve">, adjacent span</w:t>
+      </w:r>
+      <w:r>
+        <w:t xml:space="preserve"> </w:t>
+      </w:r>
+      <m:oMath>
+        <m:sSub>
+          <m:e>
+            <m:r>
+              <m:t>L</m:t>
+            </m:r>
+          </m:e>
+          <m:sub>
+            <m:r>
+              <m:t>2</m:t>
+            </m:r>
+          </m:sub>
+        </m:sSub>
+        <m:r>
+          <m:rPr>
+            <m:sty m:val="p"/>
+          </m:rPr>
+          <m:t>=</m:t>
+        </m:r>
+        <m:r>
+          <m:t>λ</m:t>
+        </m:r>
+        <m:sSub>
+          <m:e>
+            <m:r>
+              <m:t>L</m:t>
+            </m:r>
+          </m:e>
+          <m:sub>
+            <m:r>
+              <m:t>1</m:t>
+            </m:r>
+          </m:sub>
+        </m:sSub>
+      </m:oMath>
+      <w:r>
+        <w:t xml:space="preserve"> </w:t>
+      </w:r>
+      <w:r>
+        <w:t xml:space="preserve">of rigidity</w:t>
+      </w:r>
+      <w:r>
+        <w:t xml:space="preserve"> </w:t>
+      </w:r>
+      <m:oMath>
+        <m:r>
+          <m:t>E</m:t>
+        </m:r>
+        <m:sSub>
+          <m:e>
+            <m:r>
+              <m:t>I</m:t>
+            </m:r>
+          </m:e>
+          <m:sub>
+            <m:r>
+              <m:t>2</m:t>
+            </m:r>
+          </m:sub>
+        </m:sSub>
+        <m:r>
+          <m:rPr>
+            <m:sty m:val="p"/>
+          </m:rPr>
+          <m:t>=</m:t>
+        </m:r>
+        <m:r>
+          <m:t>γ</m:t>
+        </m:r>
+        <m:r>
+          <m:t>E</m:t>
+        </m:r>
+        <m:sSub>
+          <m:e>
+            <m:r>
+              <m:t>I</m:t>
+            </m:r>
+          </m:e>
+          <m:sub>
+            <m:r>
+              <m:t>1</m:t>
+            </m:r>
+          </m:sub>
+        </m:sSub>
+      </m:oMath>
+      <w:r>
+        <w:t xml:space="preserve">, and sensor at</w:t>
+      </w:r>
+      <w:r>
+        <w:t xml:space="preserve"> </w:t>
+      </w:r>
+      <m:oMath>
+        <m:r>
+          <m:t>ξ</m:t>
+        </m:r>
+        <m:sSub>
+          <m:e>
+            <m:r>
+              <m:t>L</m:t>
+            </m:r>
+          </m:e>
+          <m:sub>
+            <m:r>
+              <m:t>1</m:t>
+            </m:r>
+          </m:sub>
+        </m:sSub>
+      </m:oMath>
+      <w:r>
+        <w:t xml:space="preserve">; (b) symmetric three-span beam with side spans</w:t>
+      </w:r>
+      <w:r>
+        <w:t xml:space="preserve"> </w:t>
+      </w:r>
+      <m:oMath>
+        <m:sSub>
+          <m:e>
+            <m:r>
+              <m:t>L</m:t>
+            </m:r>
+          </m:e>
+          <m:sub>
+            <m:r>
+              <m:rPr>
+                <m:sty m:val="p"/>
+              </m:rPr>
+              <m:t>s</m:t>
+            </m:r>
+            <m:r>
+              <m:rPr>
+                <m:sty m:val="p"/>
+              </m:rPr>
+              <m:t>i</m:t>
+            </m:r>
+            <m:r>
+              <m:rPr>
+                <m:sty m:val="p"/>
+              </m:rPr>
+              <m:t>d</m:t>
+            </m:r>
+            <m:r>
+              <m:rPr>
+                <m:sty m:val="p"/>
+              </m:rPr>
+              <m:t>e</m:t>
+            </m:r>
+          </m:sub>
+        </m:sSub>
+      </m:oMath>
+      <w:r>
+        <w:t xml:space="preserve"> </w:t>
+      </w:r>
+      <w:r>
+        <w:t xml:space="preserve">of rigidity</w:t>
+      </w:r>
+      <w:r>
+        <w:t xml:space="preserve"> </w:t>
+      </w:r>
+      <m:oMath>
+        <m:r>
+          <m:t>E</m:t>
+        </m:r>
+        <m:sSub>
+          <m:e>
+            <m:r>
+              <m:t>I</m:t>
+            </m:r>
+          </m:e>
+          <m:sub>
+            <m:r>
+              <m:rPr>
+                <m:sty m:val="p"/>
+              </m:rPr>
+              <m:t>s</m:t>
+            </m:r>
+            <m:r>
+              <m:rPr>
+                <m:sty m:val="p"/>
+              </m:rPr>
+              <m:t>i</m:t>
+            </m:r>
+            <m:r>
+              <m:rPr>
+                <m:sty m:val="p"/>
+              </m:rPr>
+              <m:t>d</m:t>
+            </m:r>
+            <m:r>
+              <m:rPr>
+                <m:sty m:val="p"/>
+              </m:rPr>
+              <m:t>e</m:t>
+            </m:r>
+          </m:sub>
+        </m:sSub>
+      </m:oMath>
+      <w:r>
+        <w:t xml:space="preserve">, main span</w:t>
+      </w:r>
+      <w:r>
+        <w:t xml:space="preserve"> </w:t>
+      </w:r>
+      <m:oMath>
+        <m:sSub>
+          <m:e>
+            <m:r>
+              <m:t>L</m:t>
+            </m:r>
+          </m:e>
+          <m:sub>
+            <m:r>
+              <m:rPr>
+                <m:sty m:val="p"/>
+              </m:rPr>
+              <m:t>m</m:t>
+            </m:r>
+            <m:r>
+              <m:rPr>
+                <m:sty m:val="p"/>
+              </m:rPr>
+              <m:t>a</m:t>
+            </m:r>
+            <m:r>
+              <m:rPr>
+                <m:sty m:val="p"/>
+              </m:rPr>
+              <m:t>i</m:t>
+            </m:r>
+            <m:r>
+              <m:rPr>
+                <m:sty m:val="p"/>
+              </m:rPr>
+              <m:t>n</m:t>
+            </m:r>
+          </m:sub>
+        </m:sSub>
+        <m:r>
+          <m:rPr>
+            <m:sty m:val="p"/>
+          </m:rPr>
+          <m:t>=</m:t>
+        </m:r>
         <m:r>
           <m:t>β</m:t>
         </m:r>
-      </m:oMath>
-      <w:r>
-        <w:t xml:space="preserve">, rigidity ratio</w:t>
-      </w:r>
-      <w:r>
-        <w:t xml:space="preserve"> </w:t>
-      </w:r>
-      <m:oMath>
+        <m:sSub>
+          <m:e>
+            <m:r>
+              <m:t>L</m:t>
+            </m:r>
+          </m:e>
+          <m:sub>
+            <m:r>
+              <m:rPr>
+                <m:sty m:val="p"/>
+              </m:rPr>
+              <m:t>s</m:t>
+            </m:r>
+            <m:r>
+              <m:rPr>
+                <m:sty m:val="p"/>
+              </m:rPr>
+              <m:t>i</m:t>
+            </m:r>
+            <m:r>
+              <m:rPr>
+                <m:sty m:val="p"/>
+              </m:rPr>
+              <m:t>d</m:t>
+            </m:r>
+            <m:r>
+              <m:rPr>
+                <m:sty m:val="p"/>
+              </m:rPr>
+              <m:t>e</m:t>
+            </m:r>
+          </m:sub>
+        </m:sSub>
+      </m:oMath>
+      <w:r>
+        <w:t xml:space="preserve"> </w:t>
+      </w:r>
+      <w:r>
+        <w:t xml:space="preserve">of rigidity</w:t>
+      </w:r>
+      <w:r>
+        <w:t xml:space="preserve"> </w:t>
+      </w:r>
+      <m:oMath>
+        <m:r>
+          <m:t>E</m:t>
+        </m:r>
+        <m:sSub>
+          <m:e>
+            <m:r>
+              <m:t>I</m:t>
+            </m:r>
+          </m:e>
+          <m:sub>
+            <m:r>
+              <m:rPr>
+                <m:sty m:val="p"/>
+              </m:rPr>
+              <m:t>m</m:t>
+            </m:r>
+            <m:r>
+              <m:rPr>
+                <m:sty m:val="p"/>
+              </m:rPr>
+              <m:t>a</m:t>
+            </m:r>
+            <m:r>
+              <m:rPr>
+                <m:sty m:val="p"/>
+              </m:rPr>
+              <m:t>i</m:t>
+            </m:r>
+            <m:r>
+              <m:rPr>
+                <m:sty m:val="p"/>
+              </m:rPr>
+              <m:t>n</m:t>
+            </m:r>
+          </m:sub>
+        </m:sSub>
+        <m:r>
+          <m:rPr>
+            <m:sty m:val="p"/>
+          </m:rPr>
+          <m:t>=</m:t>
+        </m:r>
         <m:r>
           <m:t>γ</m:t>
         </m:r>
-      </m:oMath>
-      <w:r>
-        <w:t xml:space="preserve"> </w:t>
-      </w:r>
-      <w:r>
-        <w:t xml:space="preserve">and side-span sensor at</w:t>
+        <m:r>
+          <m:t>E</m:t>
+        </m:r>
+        <m:sSub>
+          <m:e>
+            <m:r>
+              <m:t>I</m:t>
+            </m:r>
+          </m:e>
+          <m:sub>
+            <m:r>
+              <m:rPr>
+                <m:sty m:val="p"/>
+              </m:rPr>
+              <m:t>s</m:t>
+            </m:r>
+            <m:r>
+              <m:rPr>
+                <m:sty m:val="p"/>
+              </m:rPr>
+              <m:t>i</m:t>
+            </m:r>
+            <m:r>
+              <m:rPr>
+                <m:sty m:val="p"/>
+              </m:rPr>
+              <m:t>d</m:t>
+            </m:r>
+            <m:r>
+              <m:rPr>
+                <m:sty m:val="p"/>
+              </m:rPr>
+              <m:t>e</m:t>
+            </m:r>
+          </m:sub>
+        </m:sSub>
+      </m:oMath>
+      <w:r>
+        <w:t xml:space="preserve">, and side-span sensor at</w:t>
       </w:r>
       <w:r>
         <w:t xml:space="preserve"> </w:t>
@@ -14070,7 +14420,7 @@
         <w:t xml:space="preserve"> </w:t>
       </w:r>
       <w:r>
-        <w:t xml:space="preserve">(dashed) and Cầu Mây layout (circle); (b) asymmetric beam, sensor at mid-span of span 1, over</w:t>
+        <w:t xml:space="preserve">(dashed) and Cầu Mây proportions with a mid side-span sensor (circle); (b) asymmetric beam, sensor at mid-span of span 1, over</w:t>
       </w:r>
       <w:r>
         <w:t xml:space="preserve"> </w:t>
@@ -14515,7 +14865,7 @@
         <w:t xml:space="preserve"> </w:t>
       </w:r>
       <w:r>
-        <w:t xml:space="preserve">Ratio of the integral constants of two trucks, per gauge and gauge average, with 95 % confidence intervals: (a) day 1, second to first 3-axle truck; (b) day 2, 5-axle to 3-axle truck. Grey bands: ±5 % and ±10 %. Red: invariance rejected; blue: equivalent within ±10 %; orange: inconclusive.</w:t>
+        <w:t xml:space="preserve">Ratio of the integral constants of two trucks, per gauge and gauge average, with 95 % confidence intervals: (a) day 1, second to first 3-axle truck, gauge average over the four wheel-path gauges; (b) day 2, 5-axle to 3-axle truck. Grey bands: ±5 % and ±10 %. Red: invariance rejected; blue: equivalent within ±10 %; orange: inconclusive.</w:t>
       </w:r>
     </w:p>
     <w:p>

</xml_diff>

<commit_message>
ASE: XII.13 round 1 fixes (7 mandatory, 11 readability)
Co-Authored-By: Claude Opus 5.5 <noreply@anthropic.com>
Claude-Session: https://claude.ai/code/session_01LGLpDzAMfdMgWcXQjLxauw
</commit_message>
<xml_diff>
--- a/manuscript/ase/word/Manuscript_ASE.docx
+++ b/manuscript/ase/word/Manuscript_ASE.docx
@@ -90,7 +90,7 @@
         <w:pStyle w:val="FirstParagraph"/>
       </w:pPr>
       <w:r>
-        <w:t xml:space="preserve">On a continuous girder the influence line of a channel changes sign over the piers, so the area under a record, which gives the total load in influence-area weighing, can vanish. This paper gives criteria for choosing, before installation, channels that observe the total load. Closed forms give the blind loci of five channel types on continuous and haunched girders; strain gauges are blind at every zero of the uniform-load moment and nearly blind in a band that can contain gauges set back from the piers. Optimal sensors lie at the extremes of the uniform-load response, and the constant follows a linear-fractional (Möbius) law in the scaled pier stiffness. A laboratory test confirms the identity. Public moving-truck records, whose reference weights vary too little to test weight discrimination, are consistent with its assumptions within margins of 10–27 % and show that vehicle-free noise covariance misleads multi-channel weighting. On an in-service box girder, two static readings leave a side-span deflection constant uncertain by a factor of 6.6, whereas the main-span constant is well determined.</w:t>
+        <w:t xml:space="preserve">On a continuous girder the influence line of a channel changes sign over the piers, so the area under a record, which gives the total load in influence-area weighing, can vanish. This paper gives criteria for choosing, before installation, channels that observe the total load. Closed forms give the blind loci of five channel types on continuous and haunched girders; strain gauges are blind at every zero of the uniform-load moment and nearly blind in a band that can contain gauges set back from the piers. Optimal sensors lie at the extremes of the uniform-load response, and the integral constant (record integral per unit total load) follows a linear-fractional (Möbius) law in the scaled pier stiffness. A laboratory test confirms the identity. Public moving-truck records, whose reference weights vary too little to test weight discrimination, are consistent with its assumptions within margins of 10–27 % and show that vehicle-free noise covariance misleads multi-channel weighting. On an in-service box girder, two static readings leave a side-span deflection constant uncertain by a factor of 6.6, whereas the main-span constant is well determined.</w:t>
       </w:r>
     </w:p>
     <w:p>
@@ -126,7 +126,7 @@
         <w:pStyle w:val="FirstParagraph"/>
       </w:pPr>
       <w:r>
-        <w:t xml:space="preserve">Heavy vehicles above the design envelope shorten the life of highway bridges and, in extreme cases, contribute to collapse (Fan et al., 2015). Knowing the loads that a bridge actually carries is therefore part of risk-informed asset management (Ventura et al., 2024). Pavement weigh-in-motion (WIM) is mature (Al-Qadi et al., 2016; Jacob et al., 2002), but it weighs the vehicle rather than the load on a particular bridge. Bridge weigh-in-motion (BWIM), introduced by Moses (1979), fits the measured response to axle loads times influence-line ordinates and has been refined with measured influence lines (OBrien et al., 2006), regularisation (OBrien et al., 2009), accuracy improvements (Žnidarič et al., 2018; Yu et al., 2016) and the transverse position of the vehicle (Yu et al., 2018). Moving-force identification recovers axle-load histories (Law et al., 1997; Chan et al., 1999; Law and Zhu, 2000), also on multi-span bridges (Zhu and Law, 2006). These methods aim at axle loads and need several sensors, a structural model or a regularised inversion.</w:t>
+        <w:t xml:space="preserve">Heavy vehicles above the design envelope shorten the life of highway bridges and, in extreme cases, contribute to collapse (Fan et al., 2015). Knowing the loads that a bridge actually carries is therefore part of risk-informed asset management (Ventura et al., 2024). Pavement weigh-in-motion (WIM) is mature (Jacob et al., 2002; Al-Qadi et al., 2016), but it weighs the vehicle rather than the load on a particular bridge. Bridge weigh-in-motion (BWIM), introduced by Moses (1979), fits the measured response to axle loads times influence-line ordinates and has been refined with measured influence lines (OBrien et al., 2006), regularisation (OBrien et al., 2009), accuracy improvements (Yu et al., 2016; Žnidarič et al., 2018) and the transverse position of the vehicle (Yu et al., 2018). Moving-force identification recovers axle-load histories (Law et al., 1997; Chan et al., 1999; Law and Zhu, 2000), also on multi-span bridges (Zhu and Law, 2006). These methods aim at axle loads and need several sensors, a structural model or a regularised inversion.</w:t>
       </w:r>
     </w:p>
     <w:p>
@@ -142,7 +142,7 @@
         <w:pStyle w:val="BodyText"/>
       </w:pPr>
       <w:r>
-        <w:t xml:space="preserve">The identity behind these methods is classical: the area under an influence line equals the response to a uniform unit load, as design codes use for distributed lane loads (Ghali et al., 2017). On continuous girders, however, the influence line changes sign over each interior support, and positive and negative areas partly cancel. Continuous bridges have been weighed from distributed fibre-optic strain (Chaudhary et al., 2025), with lane-specific influence lines (Wu et al., 2020) and from deck strain on long-span box girders (Moghadam et al., 2022, 2023a, 2023b); Deng et al. (2025) replaced the small net area of a multi-span displacement influence line by its absolute area. Sensor placement for BWIM has been posed through an augmented Kalman filter (Zhou et al., 2025), deflection-based load identification as a regularised stochastic problem (Zhang et al., 2026), and deflection influence lines have been inverted for girder stiffness (Zhou et al., 2026). None of these studies says, before installation, which channel at which position can observe the total load at all, and how robustly to uncertain boundary conditions.</w:t>
+        <w:t xml:space="preserve">The identity behind these methods is classical: the area under an influence line equals the response to a uniform unit load, as design codes use for distributed lane loads (Ghali et al., 2017). On continuous girders, however, the influence line changes sign over each interior support, and positive and negative areas partly cancel. Continuous bridges have been weighed from distributed fibre-optic strain (Chaudhary et al., 2025), with lane-specific influence lines (Wu et al., 2020) and from deck strain on long-span box girders (Moghadam et al., 2022, 2023a, 2023b); Deng et al. (2025) replaced the small net area of a multi-span displacement influence line by its absolute area. Sensor placement for BWIM has been posed through an augmented Kalman filter (Zhou et al., 2025), deflection-based load identification as a regularised stochastic problem (Zhang et al., 2026), and deflection influence lines have been inverted for girder stiffness (Zhou et al., 2026). None of these studies says, before installation, which channel at which position can observe the total load at all, and how robust that observation is to uncertain boundary conditions.</w:t>
       </w:r>
     </w:p>
     <w:p>
@@ -214,7 +214,7 @@
         <w:t xml:space="preserve"> </w:t>
       </w:r>
       <w:r>
-        <w:t xml:space="preserve">at mid-span of two equal spans), yet strain gauges are blind in every continuous girder. (ii) We derive a placement rule, optimal sensors at the extremes of the uniform-load response, and show on one day of public moving-truck records that GLS weights built from vehicle-free noise raise the out-of-sample error above that of the gauge average (20.4 % against 11.9 % of gross weight). (iii) We show that the constant depends on pier stiffness through a linear-fractional (Möbius) law and, on an in-service box girder, that two static readings leave a side-span deflection constant uncertain by a factor of 6.6, while a pier tiltmeter would reduce the Cramér–Rao bound on its logarithm from 0.87 to 0.18.</w:t>
+        <w:t xml:space="preserve">at mid-span of two equal spans), yet strain gauges are blind in every continuous girder. (ii) We derive a placement rule, optimal sensors at the extremes of the uniform-load response, and show on one day of public moving-truck records that GLS weights built from vehicle-free noise raise the out-of-sample error above that of the gauge average (20.4 % against 11.9 % of gross weight). (iii) We show that the integral constant depends on pier stiffness through a linear-fractional (Möbius) law and, on an in-service box girder, that two static readings leave a side-span deflection constant uncertain by a factor of 6.6, while a pier tiltmeter would reduce the Cramér–Rao bound on its logarithm from 0.87 to 0.18.</w:t>
       </w:r>
     </w:p>
     <w:bookmarkEnd w:id="21"/>
@@ -1162,15 +1162,70 @@
         <w:t xml:space="preserve"> </w:t>
       </w:r>
       <m:oMath>
-        <m:r>
-          <m:t>c</m:t>
-        </m:r>
-      </m:oMath>
-      <w:r>
-        <w:t xml:space="preserve"> </w:t>
-      </w:r>
-      <w:r>
-        <w:t xml:space="preserve">from the neutral axis,</w:t>
+        <m:sSub>
+          <m:e>
+            <m:r>
+              <m:t>c</m:t>
+            </m:r>
+          </m:e>
+          <m:sub>
+            <m:r>
+              <m:t>m</m:t>
+            </m:r>
+          </m:sub>
+        </m:sSub>
+      </m:oMath>
+      <w:r>
+        <w:t xml:space="preserve"> </w:t>
+      </w:r>
+      <w:r>
+        <w:t xml:space="preserve">from the neutral axis of a section of rigidity</w:t>
+      </w:r>
+      <w:r>
+        <w:t xml:space="preserve"> </w:t>
+      </w:r>
+      <m:oMath>
+        <m:r>
+          <m:t>E</m:t>
+        </m:r>
+        <m:sSub>
+          <m:e>
+            <m:r>
+              <m:t>I</m:t>
+            </m:r>
+          </m:e>
+          <m:sub>
+            <m:r>
+              <m:t>m</m:t>
+            </m:r>
+          </m:sub>
+        </m:sSub>
+      </m:oMath>
+      <w:r>
+        <w:t xml:space="preserve"> </w:t>
+      </w:r>
+      <w:r>
+        <w:t xml:space="preserve">at</w:t>
+      </w:r>
+      <w:r>
+        <w:t xml:space="preserve"> </w:t>
+      </w:r>
+      <m:oMath>
+        <m:sSub>
+          <m:e>
+            <m:r>
+              <m:t>x</m:t>
+            </m:r>
+          </m:e>
+          <m:sub>
+            <m:r>
+              <m:t>m</m:t>
+            </m:r>
+          </m:sub>
+        </m:sSub>
+      </m:oMath>
+      <w:r>
+        <w:t xml:space="preserve">,</w:t>
       </w:r>
     </w:p>
     <w:tbl>
@@ -2727,7 +2782,7 @@
         <w:pStyle w:val="BodyText"/>
       </w:pPr>
       <w:r>
-        <w:t xml:space="preserve">Its left-hand side is the indicator</w:t>
+        <w:t xml:space="preserve">Its left-hand side is the deflection indicator</w:t>
       </w:r>
       <w:r>
         <w:t xml:space="preserve"> </w:t>
@@ -2747,10 +2802,7 @@
         </m:sSub>
       </m:oMath>
       <w:r>
-        <w:t xml:space="preserve"> </w:t>
-      </w:r>
-      <w:r>
-        <w:t xml:space="preserve">of Eq. (10). Setting</w:t>
+        <w:t xml:space="preserve">, defined in Eq. (10) of Section 2.3. Setting</w:t>
       </w:r>
       <w:r>
         <w:t xml:space="preserve"> </w:t>
@@ -6557,7 +6609,7 @@
         </m:sSub>
       </m:oMath>
       <w:r>
-        <w:t xml:space="preserve">, in the units of the channel, left after re-zeroing before and after the crossing adds</w:t>
+        <w:t xml:space="preserve">, in the units of the channel, left after re-zeroing before and after the crossing, adds</w:t>
       </w:r>
       <w:r>
         <w:t xml:space="preserve"> </w:t>
@@ -8845,7 +8897,7 @@
         <w:t xml:space="preserve"> </w:t>
       </w:r>
       <w:r>
-        <w:t xml:space="preserve">at the piers, slope-deflection gives, with</w:t>
+        <w:t xml:space="preserve">at the piers, the slope-deflection method gives, with</w:t>
       </w:r>
       <w:r>
         <w:t xml:space="preserve"> </w:t>
@@ -9651,7 +9703,7 @@
         <w:t xml:space="preserve"> </w:t>
       </w:r>
       <w:r>
-        <w:t xml:space="preserve">the span length). Deflection there was measured with 0.005 mm resolution while calibrated weights of OIML class M1 were suspended at 250 mm steps: a single 40.64 N reference load, two loads 250 mm apart, and three loads. The order of the three loads was not recorded; the order used fits the record best (root-mean-square residual 0.030 mm against 0.55 mm reversed), so the three-load result is not a fully independent test.</w:t>
+        <w:t xml:space="preserve">the span length). Deflection there was measured with 0.005 mm resolution while calibrated weights of OIML class M1 were suspended at 250 mm steps: a single 40.64 N reference load, two loads 250 mm apart, and three loads. The order of the three loads was not recorded; the order used fits the record best (root-mean-square residual 0.030 mm against 0.55 mm for the reversed order), so the three-load result is not a fully independent test.</w:t>
       </w:r>
     </w:p>
     <w:p>
@@ -9694,7 +9746,7 @@
         <w:pStyle w:val="FirstParagraph"/>
       </w:pPr>
       <w:r>
-        <w:t xml:space="preserve">The Nothing-on-Road BWIM (NOR-BWIM) dataset (Moghadam and Sarlo, 2024) contains strain records of the Virginia Smart Road Bridge (Moghadam et al., 2022, 2023a, 2023b; Moghadam, 2022), a post-tensioned concrete box girder continuous over five spans of 86.5 + 3 × 144 + 86.5 m = 605 m, from transducers on the top-slab soffit near mid-span of span 2. Day 1 has 12 channels (</w:t>
+        <w:t xml:space="preserve">The Nothing-on-Road BWIM (NOR-BWIM) dataset (Moghadam and Sarlo, 2024) contains strain records of the Virginia Smart Road Bridge (Moghadam, 2022; Moghadam et al., 2022, 2023a, 2023b), a post-tensioned concrete box girder continuous over five spans of 86.5 + 3 × 144 + 86.5 m = 605 m, from transducers on the top-slab soffit near mid-span of span 2. Day 1 has 12 channels (</w:t>
       </w:r>
       <w:r>
         <w:t xml:space="preserve">“</w:t>
@@ -12699,7 +12751,7 @@
         <w:t xml:space="preserve"> </w:t>
       </w:r>
       <w:r>
-        <w:t xml:space="preserve">planned (a pier tiltmeter, an identified first frequency or an integral ratio between two gauges). Sensors belong at the extremes of</w:t>
+        <w:t xml:space="preserve">should be planned (a pier tiltmeter, an identified first frequency or an integral ratio between two gauges). Sensors belong at the extremes of</w:t>
       </w:r>
       <w:r>
         <w:t xml:space="preserve"> </w:t>
@@ -12883,7 +12935,7 @@
         <w:t xml:space="preserve"> </w:t>
       </w:r>
       <w:r>
-        <w:t xml:space="preserve">(crossing time over fundamental period; Frýba, 1999); the bound omits vehicle–bridge interaction and road roughness (Supplementary Sections S9 and S10). The method is therefore proposed for preliminary overload screening, with the threshold set with a margin below the legal limit and the design live loads (CEN, 2003; AASHTO, 2024) and instrumented BWIM for flagged vehicles; influence-line BWIM does not suffer the blindness of Table 1, because it fits the whole record shape.</w:t>
+        <w:t xml:space="preserve">(crossing time over fundamental period; Frýba, 1999); the bound omits vehicle–bridge interaction and road roughness (Supplementary Sections S9 and S10). The method is therefore proposed for preliminary overload screening. Its threshold should be set with a margin below the legal limit and the design live loads (CEN, 2003; AASHTO, 2024), and flagged vehicles should be weighed by instrumented BWIM; influence-line BWIM does not suffer the blindness of Table 1, because it fits the whole record shape.</w:t>
       </w:r>
     </w:p>
     <w:p>
@@ -13105,7 +13157,7 @@
         <w:pStyle w:val="BodyText"/>
       </w:pPr>
       <w:r>
-        <w:t xml:space="preserve">The constant is a linear-fractional (Möbius) function of the scaled pier stiffness. On a 55 + 90 + 55 m box girder, two static readings leave the side-span deflection constant uncertain by a factor of 6.6, whereas the main-span gauge is well determined; a pier tiltmeter would reduce the Cramér–Rao bound on</w:t>
+        <w:t xml:space="preserve">The constant is a linear-fractional (Möbius) function of the scaled pier stiffness. On a 55 + 90 + 55 m box girder, two static readings leave the side-span deflection constant uncertain by a factor of 6.6, whereas the main-span constant is well determined; a pier tiltmeter would reduce the Cramér–Rao bound on</w:t>
       </w:r>
       <w:r>
         <w:t xml:space="preserve"> </w:t>
@@ -13158,7 +13210,7 @@
         <w:pStyle w:val="BodyText"/>
       </w:pPr>
       <w:r>
-        <w:t xml:space="preserve">On that girder, with a 200 m record, a residual offset of 0.1 mm would bias a 25 t truck by 16–25 % even at mid main span.</w:t>
+        <w:t xml:space="preserve">On the 55 + 90 + 55 m box girder, with a 200 m record, a residual offset of 0.1 mm would bias a 25 t truck by 16–25 % even at mid main span.</w:t>
       </w:r>
     </w:p>
     <w:p>
@@ -13356,7 +13408,7 @@
         <w:pStyle w:val="FirstParagraph"/>
       </w:pPr>
       <w:r>
-        <w:t xml:space="preserve">AASHTO (2024) LRFD Bridge Design Specifications, 10th ed., American Association of State Highway and Transportation Officials, Washington, DC.</w:t>
+        <w:t xml:space="preserve">AASHTO (2024) LRFD Bridge Design Specifications. 10th ed. Washington, DC: American Association of State Highway and Transportation Officials.</w:t>
       </w:r>
     </w:p>
     <w:p>
@@ -13444,7 +13496,7 @@
         <w:pStyle w:val="BodyText"/>
       </w:pPr>
       <w:r>
-        <w:t xml:space="preserve">Frýba L (1999) Vibration of Solids and Structures under Moving Loads, 3rd ed. Thomas Telford, London.</w:t>
+        <w:t xml:space="preserve">Frýba L (1999) Vibration of Solids and Structures under Moving Loads. 3rd ed. London: Thomas Telford.</w:t>
       </w:r>
     </w:p>
     <w:p>

</xml_diff>

<commit_message>
ASE: XII.13 round 2 fixes (9 mandatory, 12 readability)
Co-Authored-By: Claude Opus 5.5 <noreply@anthropic.com>
Claude-Session: https://claude.ai/code/session_01LGLpDzAMfdMgWcXQjLxauw
</commit_message>
<xml_diff>
--- a/manuscript/ase/word/Manuscript_ASE.docx
+++ b/manuscript/ase/word/Manuscript_ASE.docx
@@ -90,7 +90,7 @@
         <w:pStyle w:val="FirstParagraph"/>
       </w:pPr>
       <w:r>
-        <w:t xml:space="preserve">On a continuous girder the influence line of a channel changes sign over the piers, so the area under a record, which gives the total load in influence-area weighing, can vanish. This paper gives criteria for choosing, before installation, channels that observe the total load. Closed forms give the blind loci of five channel types on continuous and haunched girders; strain gauges are blind at every zero of the uniform-load moment and nearly blind in a band that can contain gauges set back from the piers. Optimal sensors lie at the extremes of the uniform-load response, and the integral constant (record integral per unit total load) follows a linear-fractional (Möbius) law in the scaled pier stiffness. A laboratory test confirms the identity. Public moving-truck records, whose reference weights vary too little to test weight discrimination, are consistent with its assumptions within margins of 10–27 % and show that vehicle-free noise covariance misleads multi-channel weighting. On an in-service box girder, two static readings leave a side-span deflection constant uncertain by a factor of 6.6, whereas the main-span constant is well determined.</w:t>
+        <w:t xml:space="preserve">On a continuous girder the influence line of a channel changes sign over the piers, so the area under a record, which gives the total load in influence-area weighing, can vanish. This paper gives criteria for choosing, before installation, channels that observe the total load. Closed forms give the blind loci, where this area vanishes, of five channel types on continuous and haunched girders; strain gauges are blind at every zero of the uniform-load moment and nearly blind in a band that can contain gauges set back from the piers. Optimal sensors lie at the extremes of the uniform-load response, and the integral constant (record integral per unit total load) follows a linear-fractional (Möbius) law in the scaled pier stiffness. A laboratory test confirms the identity. Public moving-truck records, whose reference weights vary too little to test weight discrimination, are consistent with its assumptions within margins of 10–27 % and show that vehicle-free noise covariance misleads multi-channel weighting. On an in-service box girder, two static readings leave a side-span deflection constant uncertain by a factor of 6.6, whereas the main-span constant is well determined.</w:t>
       </w:r>
     </w:p>
     <w:p>
@@ -214,7 +214,7 @@
         <w:t xml:space="preserve"> </w:t>
       </w:r>
       <w:r>
-        <w:t xml:space="preserve">at mid-span of two equal spans), yet strain gauges are blind in every continuous girder. (ii) We derive a placement rule, optimal sensors at the extremes of the uniform-load response, and show on one day of public moving-truck records that GLS weights built from vehicle-free noise raise the out-of-sample error above that of the gauge average (20.4 % against 11.9 % of gross weight). (iii) We show that the integral constant depends on pier stiffness through a linear-fractional (Möbius) law and, on an in-service box girder, that two static readings leave a side-span deflection constant uncertain by a factor of 6.6, while a pier tiltmeter would reduce the Cramér–Rao bound on its logarithm from 0.87 to 0.18.</w:t>
+        <w:t xml:space="preserve">at mid-span of two equal spans), yet every continuous girder has strain blind points. (ii) We derive a placement rule, optimal sensors at the extremes of the uniform-load response, and show on one day of public moving-truck records that GLS weights built from vehicle-free noise raise the out-of-sample error above that of the gauge average (20.4 % against 11.9 % of gross weight). (iii) We show that the integral constant depends on pier stiffness through a linear-fractional (Möbius) law and, on an in-service box girder, that two static readings leave a side-span deflection constant uncertain by a factor of 6.6, while a pier tiltmeter would reduce the Cramér–Rao bound on its logarithm from 0.87 to 0.18.</w:t>
       </w:r>
     </w:p>
     <w:bookmarkEnd w:id="21"/>
@@ -1133,7 +1133,7 @@
         <w:t xml:space="preserve"> </w:t>
       </w:r>
       <w:r>
-        <w:t xml:space="preserve">over the whole path. This is the classical influence-area identity (Ojio and Yamada, 2002; Ghali et al., 2017); the second equality needs superposition only.</w:t>
+        <w:t xml:space="preserve">over the whole path. This is the classical influence-area identity (Ojio and Yamada, 2002; Ghali et al., 2017); the second equality,</w:t>
       </w:r>
       <w:r>
         <w:t xml:space="preserve"> </w:t>
@@ -1151,12 +1151,119 @@
             </m:r>
           </m:sub>
         </m:sSub>
-      </m:oMath>
-      <w:r>
-        <w:t xml:space="preserve"> </w:t>
-      </w:r>
-      <w:r>
-        <w:t xml:space="preserve">is called the integral constant, or the constant. For a strain gauge at distance</w:t>
+        <m:r>
+          <m:rPr>
+            <m:sty m:val="p"/>
+          </m:rPr>
+          <m:t>=</m:t>
+        </m:r>
+        <m:sSub>
+          <m:e>
+            <m:r>
+              <m:t>y</m:t>
+            </m:r>
+          </m:e>
+          <m:sub>
+            <m:r>
+              <m:t>m</m:t>
+            </m:r>
+          </m:sub>
+        </m:sSub>
+        <m:d>
+          <m:dPr>
+            <m:begChr m:val="["/>
+            <m:endChr m:val="]"/>
+            <m:sepChr m:val=""/>
+            <m:grow/>
+          </m:dPr>
+          <m:e>
+            <m:sSub>
+              <m:e>
+                <m:r>
+                  <m:t>q</m:t>
+                </m:r>
+              </m:e>
+              <m:sub>
+                <m:r>
+                  <m:t>0</m:t>
+                </m:r>
+              </m:sub>
+            </m:sSub>
+          </m:e>
+        </m:d>
+        <m:r>
+          <m:rPr>
+            <m:sty m:val="p"/>
+          </m:rPr>
+          <m:t>/</m:t>
+        </m:r>
+        <m:sSub>
+          <m:e>
+            <m:r>
+              <m:t>q</m:t>
+            </m:r>
+          </m:e>
+          <m:sub>
+            <m:r>
+              <m:t>0</m:t>
+            </m:r>
+          </m:sub>
+        </m:sSub>
+      </m:oMath>
+      <w:r>
+        <w:t xml:space="preserve">, needs superposition only.</w:t>
+      </w:r>
+      <w:r>
+        <w:t xml:space="preserve"> </w:t>
+      </w:r>
+      <m:oMath>
+        <m:sSub>
+          <m:e>
+            <m:r>
+              <m:t>C</m:t>
+            </m:r>
+          </m:e>
+          <m:sub>
+            <m:r>
+              <m:t>m</m:t>
+            </m:r>
+          </m:sub>
+        </m:sSub>
+      </m:oMath>
+      <w:r>
+        <w:t xml:space="preserve"> </w:t>
+      </w:r>
+      <w:r>
+        <w:t xml:space="preserve">is called the integral constant, or the constant, and a channel is blind where</w:t>
+      </w:r>
+      <w:r>
+        <w:t xml:space="preserve"> </w:t>
+      </w:r>
+      <m:oMath>
+        <m:sSub>
+          <m:e>
+            <m:r>
+              <m:t>C</m:t>
+            </m:r>
+          </m:e>
+          <m:sub>
+            <m:r>
+              <m:t>m</m:t>
+            </m:r>
+          </m:sub>
+        </m:sSub>
+        <m:r>
+          <m:rPr>
+            <m:sty m:val="p"/>
+          </m:rPr>
+          <m:t>=</m:t>
+        </m:r>
+        <m:r>
+          <m:t>0</m:t>
+        </m:r>
+      </m:oMath>
+      <w:r>
+        <w:t xml:space="preserve">. For a strain gauge at distance</w:t>
       </w:r>
       <w:r>
         <w:t xml:space="preserve"> </w:t>
@@ -1463,7 +1570,7 @@
         <w:t xml:space="preserve"> </w:t>
       </w:r>
       <w:r>
-        <w:t xml:space="preserve">from a structural model and returns</w:t>
+        <w:t xml:space="preserve">from a structural model and returns the total-load estimate</w:t>
       </w:r>
       <w:r>
         <w:t xml:space="preserve"> </w:t>
@@ -1635,7 +1742,7 @@
         <w:pStyle w:val="FirstParagraph"/>
       </w:pPr>
       <w:r>
-        <w:t xml:space="preserve">For a prismatic span under a uniform load, every channel is fixed by the two end moments, written as</w:t>
+        <w:t xml:space="preserve">For a prismatic span under a uniform load, every channel is determined by the two end moments, written as</w:t>
       </w:r>
       <w:r>
         <w:t xml:space="preserve"> </w:t>
@@ -6179,7 +6286,7 @@
         <w:t xml:space="preserve"> </w:t>
       </w:r>
       <w:r>
-        <w:t xml:space="preserve">and the rotation and shear indicators (Supplementary Section S3) equal 1, so a common threshold of 0.2 is 8 % of the simply supported value for deflection and 20 % for strain; both thresholds are design conventions. On a non-prismatic girder</w:t>
+        <w:t xml:space="preserve">equals 1, as do the rotation and shear indicators (Supplementary Section S3) for the simply supported end rotation and end shear, so a common threshold of 0.2 is 8 % of the simply supported value for deflection and 20 % for strain; both thresholds are design conventions. On a non-prismatic girder</w:t>
       </w:r>
       <w:r>
         <w:t xml:space="preserve"> </w:t>
@@ -6933,7 +7040,7 @@
         </m:sSub>
       </m:oMath>
       <w:r>
-        <w:t xml:space="preserve">, at which the bias reaches 100 %, combines sensor position, baseline stability and the lightest vehicle to be screened into one number.</w:t>
+        <w:t xml:space="preserve">, at which the bias reaches 100 %, combines sensor position and baseline stability into one number, to be compared with the lightest vehicle to be screened.</w:t>
       </w:r>
     </w:p>
     <w:bookmarkEnd w:id="24"/>
@@ -8875,7 +8982,40 @@
         <w:t xml:space="preserve"> </w:t>
       </w:r>
       <w:r>
-        <w:t xml:space="preserve">is its local slope.</w:t>
+        <w:t xml:space="preserve">is the local slope of the Möbius curve</w:t>
+      </w:r>
+      <w:r>
+        <w:t xml:space="preserve"> </w:t>
+      </w:r>
+      <m:oMath>
+        <m:sSub>
+          <m:e>
+            <m:r>
+              <m:t>C</m:t>
+            </m:r>
+          </m:e>
+          <m:sub>
+            <m:r>
+              <m:t>m</m:t>
+            </m:r>
+          </m:sub>
+        </m:sSub>
+        <m:d>
+          <m:dPr>
+            <m:begChr m:val="("/>
+            <m:endChr m:val=")"/>
+            <m:sepChr m:val=""/>
+            <m:grow/>
+          </m:dPr>
+          <m:e>
+            <m:r>
+              <m:t>κ</m:t>
+            </m:r>
+          </m:e>
+        </m:d>
+      </m:oMath>
+      <w:r>
+        <w:t xml:space="preserve">.</w:t>
       </w:r>
     </w:p>
     <w:p>
@@ -9820,7 +9960,7 @@
         <w:pStyle w:val="FirstParagraph"/>
       </w:pPr>
       <w:r>
-        <w:t xml:space="preserve">Invariance between trucks can be shown only within margins of 10–27 %. On day 1, the χ² test does not reject consistency with the measured noise for eight of the twelve gauges, but only ch11 shows equal constants for both trucks within ±10 % (Fig. 5a), about what chance alone would produce with twelve tests at the 5 % level. The four gauges without axle spikes give constants 22–26 % lower for the second truck (CIs exclude 1), but speed and truck are almost perfectly confounded on day 1 (correlation 0.98), so wheel path, local deck action or speed may cause this. On day 2, the ratio of the gauge-average constants of the 5-axle and the 3-axle truck is 0.98 (95 % CI 0.70–1.37; Fig. 5b): consistent with Eq. (2), but with eight runs it cannot exclude differences of up to about 27 %, so it is a coarse check of linearity and processing. A speed effect was neither resolved nor excluded (Supplementary Fig. S11).</w:t>
+        <w:t xml:space="preserve">Invariance between trucks can be shown only within margins of 10–27 %. On day 1, the χ² test does not reject consistency with the measured noise for eight of the twelve gauges, but only ch11 shows equal constants for both trucks within ±10 % (Fig. 5a); with twelve tests at the 5 % level, one such pass is about what chance alone would produce. The four gauges without axle spikes give constants 22–26 % lower for the second truck (CIs exclude 1), but speed and truck are almost perfectly confounded on day 1 (correlation 0.98), so wheel path, local deck action or speed may cause this. On day 2, the ratio of the gauge-average constants of the 5-axle and the 3-axle truck is 0.98 (95 % CI 0.70–1.37; Fig. 5b): consistent with Eq. (2), but with eight runs it cannot exclude differences of up to about 27 %, so it is a coarse check of linearity and processing. A speed effect was neither resolved nor excluded (Supplementary Fig. S11).</w:t>
       </w:r>
     </w:p>
     <w:p>
@@ -10309,6 +10449,9 @@
           </m:e>
           <m:sub>
             <m:r>
+              <m:rPr>
+                <m:sty m:val="p"/>
+              </m:rPr>
               <m:t>v</m:t>
             </m:r>
           </m:sub>
@@ -10611,7 +10754,7 @@
         <w:pStyle w:val="BodyText"/>
       </w:pPr>
       <w:r>
-        <w:t xml:space="preserve">The test quantity</w:t>
+        <w:t xml:space="preserve">The misfit ratio</w:t>
       </w:r>
       <w:r>
         <w:t xml:space="preserve"> </w:t>
@@ -12126,7 +12269,7 @@
         </m:d>
       </m:oMath>
       <w:r>
-        <w:t xml:space="preserve">, disagrees; which ranking governs depends on whether the strain resolution or the offset sets the noise. Load cells under the end bearings (</w:t>
+        <w:t xml:space="preserve">, disagrees. Which ranking governs depends on whether the strain resolution or the offset sets the noise. Load cells under the end bearings (</w:t>
       </w:r>
       <m:oMath>
         <m:sSub>
@@ -12224,7 +12367,7 @@
         <w:t xml:space="preserve"> </w:t>
       </w:r>
       <w:r>
-        <w:t xml:space="preserve">mm, a 220 m record,</w:t>
+        <w:t xml:space="preserve">mm, a 220 m record including a 20 m convoy allowance,</w:t>
       </w:r>
       <w:r>
         <w:t xml:space="preserve"> </w:t>
@@ -12876,7 +13019,7 @@
         <w:t xml:space="preserve"> </w:t>
       </w:r>
       <w:r>
-        <w:t xml:space="preserve">mm biases a 25 t truck by 16–25 % at a single main-span gauge and by 41–271 % at a single side-span gauge (Supplementary Table S15). With present absolute-deflection technology, single-point integral weighing on a long-span girder is therefore marginal even at the best location, and non-contact techniques must establish their residual offset on site, because environmental effects act over the same window (Sohn, 2007; Cross et al., 2013). Speed enters through the response and its measurement: on lane A of the field records, speeds from a low-pass fit were 1.139 times those from the axle spikes (standard deviation 0.124, 22 runs), so the speed estimator alone can shift the weight by more than 10 %. The quasi-static error for a constant force crossing the laboratory beam is at most about 1 % when</w:t>
+        <w:t xml:space="preserve">mm biases a 25 t truck by 16–25 % at a single main-span gauge and by 41–271 % at a single side-span gauge (Supplementary Table S15). With present absolute-deflection technology, single-point influence-area weighing on a long-span girder is therefore marginal even at the best location, and non-contact techniques must establish their residual offset on site, because environmental effects act over the same window (Sohn, 2007; Cross et al., 2013). Speed enters through the response and its measurement: on lane A of the field records, speeds from a low-pass fit were 1.139 times those from the axle spikes (standard deviation 0.124, 22 runs), so the speed estimator alone can shift the weight by more than 10 %. The quasi-static error for a constant force crossing the laboratory beam is at most about 1 % when</w:t>
       </w:r>
       <w:r>
         <w:t xml:space="preserve"> </w:t>
@@ -13424,7 +13567,7 @@
         <w:pStyle w:val="BodyText"/>
       </w:pPr>
       <w:r>
-        <w:t xml:space="preserve">Agüero-Barrantes P, Christenson RE and Lobo-Aguilar S (2023) Utilizing Kriging metamodeling to provide practical and effective bridge weigh-in-motion. J. Bridge Eng. 28(2): 04022138. DOI: 10.1061/JBENF2.BEENG-5760.</w:t>
+        <w:t xml:space="preserve">Agüero-Barrantes P, Christenson RE and Lobo-Aguilar S (2023) Utilizing Kriging metamodeling to provide practical and effective bridge weigh-in-motion. Journal of Bridge Engineering 28(2): 04022138. DOI: 10.1061/JBENF2.BEENG-5760.</w:t>
       </w:r>
     </w:p>
     <w:p>
@@ -13440,7 +13583,7 @@
         <w:pStyle w:val="BodyText"/>
       </w:pPr>
       <w:r>
-        <w:t xml:space="preserve">Cardini AJ and DeWolf JT (2009) Implementation of a long-term bridge weigh-in-motion system for a steel girder bridge in the interstate highway system. J. Bridge Eng. 14(6): 418–423. DOI: 10.1061/(ASCE)1084-0702(2009)14:6(418).</w:t>
+        <w:t xml:space="preserve">Cardini AJ and DeWolf JT (2009) Implementation of a long-term bridge weigh-in-motion system for a steel girder bridge in the interstate highway system. Journal of Bridge Engineering 14(6): 418–423. DOI: 10.1061/(ASCE)1084-0702(2009)14:6(418).</w:t>
       </w:r>
     </w:p>
     <w:p>
@@ -13448,7 +13591,7 @@
         <w:pStyle w:val="BodyText"/>
       </w:pPr>
       <w:r>
-        <w:t xml:space="preserve">CEN (2003) EN 1991-2:2003, Eurocode 1: Actions on Structures – Part 2: Traffic Loads on Bridges, CEN, Brussels.</w:t>
+        <w:t xml:space="preserve">CEN (2003) EN 1991-2:2003, Eurocode 1: Actions on Structures – Part 2: Traffic Loads on Bridges. Brussels: CEN.</w:t>
       </w:r>
     </w:p>
     <w:p>
@@ -13456,7 +13599,7 @@
         <w:pStyle w:val="BodyText"/>
       </w:pPr>
       <w:r>
-        <w:t xml:space="preserve">Chan THT, Law SS, Yung TH and Yuan XR (1999) An interpretive method for moving force identification. J. Sound Vib. 219(3): 503–524. DOI: 10.1006/jsvi.1998.1904.</w:t>
+        <w:t xml:space="preserve">Chan THT, Law SS, Yung TH and Yuan XR (1999) An interpretive method for moving force identification. Journal of Sound and Vibration 219(3): 503–524. DOI: 10.1006/jsvi.1998.1904.</w:t>
       </w:r>
     </w:p>
     <w:p>
@@ -13472,7 +13615,7 @@
         <w:pStyle w:val="BodyText"/>
       </w:pPr>
       <w:r>
-        <w:t xml:space="preserve">Cross EJ, Koo KY, Brownjohn JMW and Worden K (2013) Long-term monitoring and data analysis of the Tamar Bridge. Mech. Syst. Signal Process. 35(1–2): 16–34. DOI: 10.1016/j.ymssp.2012.08.026.</w:t>
+        <w:t xml:space="preserve">Cross EJ, Koo KY, Brownjohn JMW and Worden K (2013) Long-term monitoring and data analysis of the Tamar Bridge. Mechanical Systems and Signal Processing 35(1–2): 16–34. DOI: 10.1016/j.ymssp.2012.08.026.</w:t>
       </w:r>
     </w:p>
     <w:p>
@@ -13480,7 +13623,7 @@
         <w:pStyle w:val="BodyText"/>
       </w:pPr>
       <w:r>
-        <w:t xml:space="preserve">Deng L, Liu P, Huang T and Kaewunruen S (2025) A novel moving load identification method for continuous rigid-frame bridges using a field-based displacement influence line. Appl. Sci. 15(11): 6028. DOI: 10.3390/app15116028.</w:t>
+        <w:t xml:space="preserve">Deng L, Liu P, Huang T and Kaewunruen S (2025) A novel moving load identification method for continuous rigid-frame bridges using a field-based displacement influence line. Applied Sciences 15(11): 6028. DOI: 10.3390/app15116028.</w:t>
       </w:r>
     </w:p>
     <w:p>
@@ -13488,7 +13631,7 @@
         <w:pStyle w:val="BodyText"/>
       </w:pPr>
       <w:r>
-        <w:t xml:space="preserve">Fan Y, Zhu J, Pei J and Li Z (2015) Analysis for Yangmingtan Bridge collapse. Eng. Fail. Anal. 56: 20–27. DOI: 10.1016/j.engfailanal.2015.05.003.</w:t>
+        <w:t xml:space="preserve">Fan Y, Zhu J, Pei J and Li Z (2015) Analysis for Yangmingtan Bridge collapse. Engineering Failure Analysis 56: 20–27. DOI: 10.1016/j.engfailanal.2015.05.003.</w:t>
       </w:r>
     </w:p>
     <w:p>
@@ -13504,7 +13647,7 @@
         <w:pStyle w:val="BodyText"/>
       </w:pPr>
       <w:r>
-        <w:t xml:space="preserve">Ghali A, Neville AM and Brown TG (2017) Structural Analysis: A Unified Classical and Matrix Approach. CRC Press, Boca Raton. DOI: 10.1201/9781315273006.</w:t>
+        <w:t xml:space="preserve">Ghali A, Neville AM and Brown TG (2017) Structural Analysis: A Unified Classical and Matrix Approach. Boca Raton: CRC Press. DOI: 10.1201/9781315273006.</w:t>
       </w:r>
     </w:p>
     <w:p>
@@ -13512,7 +13655,7 @@
         <w:pStyle w:val="BodyText"/>
       </w:pPr>
       <w:r>
-        <w:t xml:space="preserve">Helmi K, Bakht B and Mufti A (2014) Accurate measurements of gross vehicle weight through bridge weigh-in-motion: a case study. J. Civ. Struct. Health Monit. 4(3): 195–208. DOI: 10.1007/s13349-014-0076-5.</w:t>
+        <w:t xml:space="preserve">Helmi K, Bakht B and Mufti A (2014) Accurate measurements of gross vehicle weight through bridge weigh-in-motion: a case study. Journal of Civil Structural Health Monitoring 4(3): 195–208. DOI: 10.1007/s13349-014-0076-5.</w:t>
       </w:r>
     </w:p>
     <w:p>
@@ -13520,7 +13663,7 @@
         <w:pStyle w:val="BodyText"/>
       </w:pPr>
       <w:r>
-        <w:t xml:space="preserve">Jacob B, OBrien EJ and Jehaes S (eds) (2002) Weigh-in-Motion of Road Vehicles: Final Report of the COST 323 Action. LCPC, Paris.</w:t>
+        <w:t xml:space="preserve">Jacob B, OBrien EJ and Jehaes S (eds) (2002) Weigh-in-Motion of Road Vehicles: Final Report of the COST 323 Action. Paris: LCPC.</w:t>
       </w:r>
     </w:p>
     <w:p>
@@ -13528,7 +13671,7 @@
         <w:pStyle w:val="BodyText"/>
       </w:pPr>
       <w:r>
-        <w:t xml:space="preserve">Law SS and Zhu XQ (2000) Study on different beam models in moving force identification. J. Sound Vib. 234(4): 661–679. DOI: 10.1006/jsvi.2000.2867.</w:t>
+        <w:t xml:space="preserve">Law SS and Zhu XQ (2000) Study on different beam models in moving force identification. Journal of Sound and Vibration 234(4): 661–679. DOI: 10.1006/jsvi.2000.2867.</w:t>
       </w:r>
     </w:p>
     <w:p>
@@ -13536,7 +13679,7 @@
         <w:pStyle w:val="BodyText"/>
       </w:pPr>
       <w:r>
-        <w:t xml:space="preserve">Law SS, Chan THT and Zeng QH (1997) Moving force identification: a time domain method. J. Sound Vib. 201(1): 1–22. DOI: 10.1006/jsvi.1996.0774.</w:t>
+        <w:t xml:space="preserve">Law SS, Chan THT and Zeng QH (1997) Moving force identification: a time domain method. Journal of Sound and Vibration 201(1): 1–22. DOI: 10.1006/jsvi.1996.0774.</w:t>
       </w:r>
     </w:p>
     <w:p>
@@ -13568,7 +13711,7 @@
         <w:pStyle w:val="BodyText"/>
       </w:pPr>
       <w:r>
-        <w:t xml:space="preserve">Moghadam A, AlHamaydeh M and Sarlo R (2022) Bridge-weigh-in-motion approach for simultaneous multiple vehicles on concrete-box-girder bridges. Autom. Constr. 137: 104179. DOI: 10.1016/j.autcon.2022.104179.</w:t>
+        <w:t xml:space="preserve">Moghadam A, AlHamaydeh M and Sarlo R (2022) Bridge-weigh-in-motion approach for simultaneous multiple vehicles on concrete-box-girder bridges. Automation in Construction 137: 104179. DOI: 10.1016/j.autcon.2022.104179.</w:t>
       </w:r>
     </w:p>
     <w:p>
@@ -13576,7 +13719,7 @@
         <w:pStyle w:val="BodyText"/>
       </w:pPr>
       <w:r>
-        <w:t xml:space="preserve">Moghadam A, AlHamaydeh M and Sarlo R (2023a) Nothing-on-road bridge-weigh-in-motion used for long-span, concrete-box-girder bridges: an experimental case study. J. Struct. Integr. Maint. 8(2): 79–90. DOI: 10.1080/24705314.2023.2165606.</w:t>
+        <w:t xml:space="preserve">Moghadam A, AlHamaydeh M and Sarlo R (2023a) Nothing-on-road bridge-weigh-in-motion used for long-span, concrete-box-girder bridges: an experimental case study. Journal of Structural Integrity and Maintenance 8(2): 79–90. DOI: 10.1080/24705314.2023.2165606.</w:t>
       </w:r>
     </w:p>
     <w:p>
@@ -13584,7 +13727,7 @@
         <w:pStyle w:val="BodyText"/>
       </w:pPr>
       <w:r>
-        <w:t xml:space="preserve">Moghadam A, AlHamaydeh M and Sarlo R (2023b) Dual-purpose procedure for bridge health monitoring and weigh-in-motion used for multiple-vehicle events. Autom. Constr. 148: 104768. DOI: 10.1016/j.autcon.2023.104768.</w:t>
+        <w:t xml:space="preserve">Moghadam A, AlHamaydeh M and Sarlo R (2023b) Dual-purpose procedure for bridge health monitoring and weigh-in-motion used for multiple-vehicle events. Automation in Construction 148: 104768. DOI: 10.1016/j.autcon.2023.104768.</w:t>
       </w:r>
     </w:p>
     <w:p>
@@ -13592,7 +13735,7 @@
         <w:pStyle w:val="BodyText"/>
       </w:pPr>
       <w:r>
-        <w:t xml:space="preserve">Moses F (1979) Weigh-in-motion system using instrumented bridges. Transp. Eng. J. ASCE 105(3): 233–249. DOI: 10.1061/TPEJAN.0000783.</w:t>
+        <w:t xml:space="preserve">Moses F (1979) Weigh-in-motion system using instrumented bridges. Transportation Engineering Journal of ASCE 105(3): 233–249. DOI: 10.1061/TPEJAN.0000783.</w:t>
       </w:r>
     </w:p>
     <w:p>
@@ -13600,7 +13743,7 @@
         <w:pStyle w:val="BodyText"/>
       </w:pPr>
       <w:r>
-        <w:t xml:space="preserve">Nguyen QB, Hoang T and Nguyen HS (2024) [Determination of the load applied on a simply supported beam based on measured deflection data]. J. Sci. Technol. Civ. Eng. (HUCE) 18(2V): 61–71 (in Vietnamese). DOI: 10.31814/stce.huce2024-18(2V)-05.</w:t>
+        <w:t xml:space="preserve">Nguyen QB, Hoang T and Nguyen HS (2024) [Determination of the load applied on a simply supported beam based on measured deflection data]. Journal of Science and Technology in Civil Engineering (HUCE) 18(2V): 61–71 (in Vietnamese). DOI: 10.31814/stce.huce2024-18(2V)-05.</w:t>
       </w:r>
     </w:p>
     <w:p>
@@ -13608,7 +13751,7 @@
         <w:pStyle w:val="BodyText"/>
       </w:pPr>
       <w:r>
-        <w:t xml:space="preserve">OBrien EJ, Quilligan MJ and Karoumi R (2006) Calculating an influence line from direct measurements. Proc. Inst. Civ. Eng. Bridge Eng. 159(1): 31–34. DOI: 10.1680/bren.2006.159.1.31.</w:t>
+        <w:t xml:space="preserve">OBrien EJ, Quilligan MJ and Karoumi R (2006) Calculating an influence line from direct measurements. Proceedings of the Institution of Civil Engineers: Bridge Engineering 159(1): 31–34. DOI: 10.1680/bren.2006.159.1.31.</w:t>
       </w:r>
     </w:p>
     <w:p>
@@ -13616,7 +13759,7 @@
         <w:pStyle w:val="BodyText"/>
       </w:pPr>
       <w:r>
-        <w:t xml:space="preserve">OBrien EJ, Rowley CW, González A and Green MF (2009) A regularised solution to the bridge weigh-in-motion equations. Int. J. Heavy Veh. Syst. 16(3): 310–327. DOI: 10.1504/IJHVS.2009.027135.</w:t>
+        <w:t xml:space="preserve">OBrien EJ, Rowley CW, González A and Green MF (2009) A regularised solution to the bridge weigh-in-motion equations. International Journal of Heavy Vehicle Systems 16(3): 310–327. DOI: 10.1504/IJHVS.2009.027135.</w:t>
       </w:r>
     </w:p>
     <w:p>
@@ -13632,7 +13775,7 @@
         <w:pStyle w:val="BodyText"/>
       </w:pPr>
       <w:r>
-        <w:t xml:space="preserve">Shi S, Yarnold M, Hurlebaus S and Mander J (2025) Evaluation of a load cell-based bridge weigh-in-motion system. Transp. Res. Rec. 2679(2): 535–549. DOI: 10.1177/03611981241263336.</w:t>
+        <w:t xml:space="preserve">Shi S, Yarnold M, Hurlebaus S and Mander J (2025) Evaluation of a load cell-based bridge weigh-in-motion system. Transportation Research Record 2679(2): 535–549. DOI: 10.1177/03611981241263336.</w:t>
       </w:r>
     </w:p>
     <w:p>
@@ -13640,7 +13783,7 @@
         <w:pStyle w:val="BodyText"/>
       </w:pPr>
       <w:r>
-        <w:t xml:space="preserve">Sohn H (2007) Effects of environmental and operational variability on structural health monitoring. Philos. Trans. R. Soc. A 365(1851): 539–560. DOI: 10.1098/rsta.2006.1935.</w:t>
+        <w:t xml:space="preserve">Sohn H (2007) Effects of environmental and operational variability on structural health monitoring. Philosophical Transactions of the Royal Society A 365(1851): 539–560. DOI: 10.1098/rsta.2006.1935.</w:t>
       </w:r>
     </w:p>
     <w:p>
@@ -13648,7 +13791,7 @@
         <w:pStyle w:val="BodyText"/>
       </w:pPr>
       <w:r>
-        <w:t xml:space="preserve">Ventura R, Barabino B and Maternini G (2024) Estimating the frequency of traffic overloading on road bridges. J. Traffic Transp. Eng. (Engl. Ed.) 11(4): 776–796. DOI: 10.1016/j.jtte.2023.11.005.</w:t>
+        <w:t xml:space="preserve">Ventura R, Barabino B and Maternini G (2024) Estimating the frequency of traffic overloading on road bridges. Journal of Traffic and Transportation Engineering (English Edition) 11(4): 776–796. DOI: 10.1016/j.jtte.2023.11.005.</w:t>
       </w:r>
     </w:p>
     <w:p>
@@ -13656,7 +13799,7 @@
         <w:pStyle w:val="BodyText"/>
       </w:pPr>
       <w:r>
-        <w:t xml:space="preserve">Wu H, Zhao H, Liu J and Hu Z (2020) A filtering-based bridge weigh-in-motion system on a continuous multi-girder bridge considering the influence lines of different lanes. Front. Struct. Civ. Eng. 14(5): 1232–1246. DOI: 10.1007/s11709-020-0653-0.</w:t>
+        <w:t xml:space="preserve">Wu H, Zhao H, Liu J and Hu Z (2020) A filtering-based bridge weigh-in-motion system on a continuous multi-girder bridge considering the influence lines of different lanes. Frontiers of Structural and Civil Engineering 14(5): 1232–1246. DOI: 10.1007/s11709-020-0653-0.</w:t>
       </w:r>
     </w:p>
     <w:p>
@@ -13664,7 +13807,7 @@
         <w:pStyle w:val="BodyText"/>
       </w:pPr>
       <w:r>
-        <w:t xml:space="preserve">Yan WJ, Hao TT, Yuen KV and Papadimitriou C (2022) Monitoring gross vehicle weight with a probabilistic and influence line-free bridge weight-in-motion scheme based on a transmissibility-like index. Mech. Syst. Signal Process. 177: 109133. DOI: 10.1016/j.ymssp.2022.109133.</w:t>
+        <w:t xml:space="preserve">Yan WJ, Hao TT, Yuen KV and Papadimitriou C (2022) Monitoring gross vehicle weight with a probabilistic and influence line-free bridge weight-in-motion scheme based on a transmissibility-like index. Mechanical Systems and Signal Processing 177: 109133. DOI: 10.1016/j.ymssp.2022.109133.</w:t>
       </w:r>
     </w:p>
     <w:p>
@@ -13672,7 +13815,7 @@
         <w:pStyle w:val="BodyText"/>
       </w:pPr>
       <w:r>
-        <w:t xml:space="preserve">Yang J, Hou P and Yang C (2021) Study on the method of moving load identification based on strain influence line. Appl. Sci. 11(2): 853. DOI: 10.3390/app11020853.</w:t>
+        <w:t xml:space="preserve">Yang J, Hou P and Yang C (2021) Study on the method of moving load identification based on strain influence line. Applied Sciences 11(2): 853. DOI: 10.3390/app11020853.</w:t>
       </w:r>
     </w:p>
     <w:p>
@@ -13680,7 +13823,7 @@
         <w:pStyle w:val="BodyText"/>
       </w:pPr>
       <w:r>
-        <w:t xml:space="preserve">Yu Y, Cai CS and Deng L (2016) State-of-the-art review on bridge weigh-in-motion technology. Adv. Struct. Eng. 19(9): 1514–1530. DOI: 10.1177/1369433216655922.</w:t>
+        <w:t xml:space="preserve">Yu Y, Cai CS and Deng L (2016) State-of-the-art review on bridge weigh-in-motion technology. Advances in Structural Engineering 19(9): 1514–1530. DOI: 10.1177/1369433216655922.</w:t>
       </w:r>
     </w:p>
     <w:p>
@@ -13688,7 +13831,7 @@
         <w:pStyle w:val="BodyText"/>
       </w:pPr>
       <w:r>
-        <w:t xml:space="preserve">Yu Y, Cai CS and Deng L (2018) Nothing-on-road bridge weigh-in-motion considering the transverse position of the vehicle. Struct. Infrastruct. Eng. 14(8): 1108–1122. DOI: 10.1080/15732479.2017.1401095.</w:t>
+        <w:t xml:space="preserve">Yu Y, Cai CS and Deng L (2018) Nothing-on-road bridge weigh-in-motion considering the transverse position of the vehicle. Structure and Infrastructure Engineering 14(8): 1108–1122. DOI: 10.1080/15732479.2017.1401095.</w:t>
       </w:r>
     </w:p>
     <w:p>
@@ -13704,7 +13847,7 @@
         <w:pStyle w:val="BodyText"/>
       </w:pPr>
       <w:r>
-        <w:t xml:space="preserve">Zhou C, Demartino C, Narazaki Y, Xu Y, Chatzi E and Spencer BF (2025) Optimal sensor placement for bridge weigh-in-motion using an augmented Kalman filter. Mech. Syst. Signal Process. 241: 113522. DOI: 10.1016/j.ymssp.2025.113522.</w:t>
+        <w:t xml:space="preserve">Zhou C, Demartino C, Narazaki Y, Xu Y, Chatzi E and Spencer BF (2025) Optimal sensor placement for bridge weigh-in-motion using an augmented Kalman filter. Mechanical Systems and Signal Processing 241: 113522. DOI: 10.1016/j.ymssp.2025.113522.</w:t>
       </w:r>
     </w:p>
     <w:p>
@@ -13712,7 +13855,7 @@
         <w:pStyle w:val="BodyText"/>
       </w:pPr>
       <w:r>
-        <w:t xml:space="preserve">Zhou Y, Feng Z, Di SK and Jia ZJ (2026) A novel approach for bending stiffness inversion and rapid evaluation of continuous beam bridges based on a deflection influence line. Struct. Control Health Monit. 2026: 1361157. DOI: 10.1155/stc/1361157.</w:t>
+        <w:t xml:space="preserve">Zhou Y, Feng Z, Di SK and Jia ZJ (2026) A novel approach for bending stiffness inversion and rapid evaluation of continuous beam bridges based on a deflection influence line. Structural Control and Health Monitoring 2026: 1361157. DOI: 10.1155/stc/1361157.</w:t>
       </w:r>
     </w:p>
     <w:p>
@@ -13720,7 +13863,7 @@
         <w:pStyle w:val="BodyText"/>
       </w:pPr>
       <w:r>
-        <w:t xml:space="preserve">Zhu XQ and Law SS (2006) Moving load identification on multi-span continuous bridges with elastic bearings. Mech. Syst. Signal Process. 20(7): 1759–1782. DOI: 10.1016/j.ymssp.2005.06.004.</w:t>
+        <w:t xml:space="preserve">Zhu XQ and Law SS (2006) Moving load identification on multi-span continuous bridges with elastic bearings. Mechanical Systems and Signal Processing 20(7): 1759–1782. DOI: 10.1016/j.ymssp.2005.06.004.</w:t>
       </w:r>
     </w:p>
     <w:p>
@@ -13728,7 +13871,7 @@
         <w:pStyle w:val="BodyText"/>
       </w:pPr>
       <w:r>
-        <w:t xml:space="preserve">Zhu J, Wang C, Qi T and Zhou Y (2022) Vehicle load identification on orthotropic steel box beam bridge based on the strain response area. Appl. Sci. 12(23): 12394. DOI: 10.3390/app122312394.</w:t>
+        <w:t xml:space="preserve">Zhu J, Wang C, Qi T and Zhou Y (2022) Vehicle load identification on orthotropic steel box beam bridge based on the strain response area. Applied Sciences 12(23): 12394. DOI: 10.3390/app122312394.</w:t>
       </w:r>
     </w:p>
     <w:p>
@@ -13736,7 +13879,7 @@
         <w:pStyle w:val="BodyText"/>
       </w:pPr>
       <w:r>
-        <w:t xml:space="preserve">Žnidarič A, Kalin J and Kreslin M (2018) Improved accuracy and robustness of bridge weigh-in-motion systems. Struct. Infrastruct. Eng. 14(4): 412–424. DOI: 10.1080/15732479.2017.1406958.</w:t>
+        <w:t xml:space="preserve">Žnidarič A, Kalin J and Kreslin M (2018) Improved accuracy and robustness of bridge weigh-in-motion systems. Structure and Infrastructure Engineering 14(4): 412–424. DOI: 10.1080/15732479.2017.1406958.</w:t>
       </w:r>
     </w:p>
     <w:bookmarkEnd w:id="49"/>
@@ -15230,7 +15373,10 @@
         </m:r>
       </m:oMath>
       <w:r>
-        <w:t xml:space="preserve">,</w:t>
+        <w:t xml:space="preserve"> </w:t>
+      </w:r>
+      <w:r>
+        <w:t xml:space="preserve">implied by a misfit within</w:t>
       </w:r>
       <w:r>
         <w:t xml:space="preserve"> </w:t>
@@ -15244,7 +15390,7 @@
         <w:t xml:space="preserve"> </w:t>
       </w:r>
       <w:r>
-        <w:t xml:space="preserve">= 5.3 %; (b) N8 and N7 indicators and cancellation ratios along the best static fit</w:t>
+        <w:t xml:space="preserve">= 5.3 % at each gauge; (b) N8 and N7 indicators and cancellation ratios along the best static fit</w:t>
       </w:r>
       <w:r>
         <w:t xml:space="preserve"> </w:t>

</xml_diff>

<commit_message>
ASE: XII.13 round 3 fixes (extra round approved)
Co-Authored-By: Claude Opus 5.5 <noreply@anthropic.com>
Claude-Session: https://claude.ai/code/session_01LGLpDzAMfdMgWcXQjLxauw
</commit_message>
<xml_diff>
--- a/manuscript/ase/word/Manuscript_ASE.docx
+++ b/manuscript/ase/word/Manuscript_ASE.docx
@@ -90,7 +90,7 @@
         <w:pStyle w:val="FirstParagraph"/>
       </w:pPr>
       <w:r>
-        <w:t xml:space="preserve">On a continuous girder the influence line of a channel changes sign over the piers, so the area under a record, which gives the total load in influence-area weighing, can vanish. This paper gives criteria for choosing, before installation, channels that observe the total load. Closed forms give the blind loci, where this area vanishes, of five channel types on continuous and haunched girders; strain gauges are blind at every zero of the uniform-load moment and nearly blind in a band that can contain gauges set back from the piers. Optimal sensors lie at the extremes of the uniform-load response, and the integral constant (record integral per unit total load) follows a linear-fractional (Möbius) law in the scaled pier stiffness. A laboratory test confirms the identity. Public moving-truck records, whose reference weights vary too little to test weight discrimination, are consistent with its assumptions within margins of 10–27 % and show that vehicle-free noise covariance misleads multi-channel weighting. On an in-service box girder, two static readings leave a side-span deflection constant uncertain by a factor of 6.6, whereas the main-span constant is well determined.</w:t>
+        <w:t xml:space="preserve">On a continuous girder the influence line of a channel changes sign over the piers, so the area under a record, which gives the total load in influence-area weighing, can vanish. This paper gives criteria for choosing, before installation, channels that observe the total load. Closed forms give the blind loci, where this area vanishes, of five channel types on continuous and haunched girders; strain gauges are blind at every zero of the uniform-load moment and nearly blind in a band that can contain gauges set back from the piers. Optimal sensors lie at the extremes of the uniform-load response, and the integral constant (record integral per unit total load) follows a linear-fractional (Möbius) law in the scaled pier stiffness. A laboratory test confirms the identity. Public moving-truck records, whose reference weights vary too little to test weight discrimination, are consistent with the assumptions of the identity within margins of 10–27 % and show that vehicle-free noise covariance misleads multi-channel weighting. On an in-service box girder, two static readings leave a side-span deflection constant uncertain by a factor of 6.6, whereas the main-span constant is well determined.</w:t>
       </w:r>
     </w:p>
     <w:p>
@@ -142,7 +142,7 @@
         <w:pStyle w:val="BodyText"/>
       </w:pPr>
       <w:r>
-        <w:t xml:space="preserve">The identity behind these methods is classical: the area under an influence line equals the response to a uniform unit load, as design codes use for distributed lane loads (Ghali et al., 2017). On continuous girders, however, the influence line changes sign over each interior support, and positive and negative areas partly cancel. Continuous bridges have been weighed from distributed fibre-optic strain (Chaudhary et al., 2025), with lane-specific influence lines (Wu et al., 2020) and from deck strain on long-span box girders (Moghadam et al., 2022, 2023a, 2023b); Deng et al. (2025) replaced the small net area of a multi-span displacement influence line by its absolute area. Sensor placement for BWIM has been posed through an augmented Kalman filter (Zhou et al., 2025), deflection-based load identification as a regularised stochastic problem (Zhang et al., 2026), and deflection influence lines have been inverted for girder stiffness (Zhou et al., 2026). None of these studies says, before installation, which channel at which position can observe the total load at all, and how robust that observation is to uncertain boundary conditions.</w:t>
+        <w:t xml:space="preserve">The identity behind these methods is classical: the area under an influence line equals the response to a uniform unit load, as design codes use for distributed lane loads (Ghali et al., 2017). On continuous girders, however, the influence line changes sign over each interior support, and positive and negative areas partly cancel. Continuous bridges have been weighed from distributed fibre-optic strain (Chaudhary et al., 2025), with lane-specific influence lines (Wu et al., 2020) and from deck strain on long-span box girders (Moghadam et al., 2022, 2023a, 2023b); Deng et al. (2025) replaced the small net area of a multi-span displacement influence line by its absolute area. Sensor placement for BWIM has been posed through an augmented Kalman filter (Zhou et al., 2025). Deflection-based load identification has been posed as a regularised stochastic problem (Zhang et al., 2026), and deflection influence lines have been inverted for girder stiffness (Zhou et al., 2026). None of these studies says, before installation, which channel at which position can observe the total load at all, and how robust that observation is to uncertain boundary conditions.</w:t>
       </w:r>
     </w:p>
     <w:p>
@@ -6286,7 +6286,7 @@
         <w:t xml:space="preserve"> </w:t>
       </w:r>
       <w:r>
-        <w:t xml:space="preserve">equals 1, as do the rotation and shear indicators (Supplementary Section S3) for the simply supported end rotation and end shear, so a common threshold of 0.2 is 8 % of the simply supported value for deflection and 20 % for strain; both thresholds are design conventions. On a non-prismatic girder</w:t>
+        <w:t xml:space="preserve">equals 1. The rotation and shear indicators (Supplementary Section S3) equal 1 for the simply supported end rotation and end shear. A common threshold of 0.2 is 8 % of the simply supported value for deflection and 20 % for strain; both thresholds are design conventions. On a non-prismatic girder</w:t>
       </w:r>
       <w:r>
         <w:t xml:space="preserve"> </w:t>
@@ -9976,7 +9976,7 @@
         <w:pStyle w:val="BodyText"/>
       </w:pPr>
       <w:r>
-        <w:t xml:space="preserve">Each deck gauge also needs its own constant. The constant of ch11 is 3.9 times that of ch8, although the gauges are within 6 m of each other and a one-dimensional beam model predicts nearly equal constants, and the st36-to-st40 ratio changes with the lane by about 2.5 standard errors, so gauge-factor spread is an unlikely cause. The deck-soffit gauges also respond to slab bending and shear lag, so the constant must come from a weighed vehicle or a three-dimensional model. A beam model still reproduces the global shape of the strain histories (</w:t>
+        <w:t xml:space="preserve">Each deck gauge also needs its own constant. The constant of ch11 is 3.9 times that of ch8, although the gauges are within 6 m of each other and a one-dimensional beam model predicts nearly equal constants, and the st36-to-st40 ratio changes with the lane by about 2.5 standard errors, so a spread of gauge factors is an unlikely cause of the differences between gauges. The deck-soffit gauges also respond to slab bending and shear lag, so the constant must come from a weighed vehicle or a three-dimensional model. A beam model still reproduces the global shape of the strain histories (</w:t>
       </w:r>
       <m:oMath>
         <m:sSup>
@@ -10427,7 +10427,7 @@
         </m:r>
       </m:oMath>
       <w:r>
-        <w:t xml:space="preserve">), 2.40 m deep at mid-span and 5.40 m at the piers. The inner piers, including T7, are monolithic with the girder; the end supports T5 and T8 carry pot bearings. In the June 2020 acceptance test, 3-axle trucks with a weighed mean of 25.06 t stood in the side and main spans, and dial gauges read the peak deflection at N8, in the side span at 0.4L (22 m) from T8, and at N7, mid main span. Each section has six readings (three points across, central and eccentric arrangements), with means of 5.55 mm at N8 and 15.42 mm at N7 (Supplementary Tables S11–S13).</w:t>
+        <w:t xml:space="preserve">), 2.40 m deep at mid-span and 5.40 m at the piers. The inner piers, including T7, are monolithic with the girder; the end supports T5 and T8 carry pot bearings. In the June 2020 acceptance test, 3-axle trucks with a mean weighed gross weight of 25.06 t stood in the side and main spans, and dial gauges read the peak deflection at N8, in the side span at 0.4L (22 m) from T8, and at N7, mid main span. Each section has six readings (three points across, central and eccentric arrangements), with means of 5.55 mm at N8 and 15.42 mm at N7 (Supplementary Tables S11–S13).</w:t>
       </w:r>
     </w:p>
     <w:p>
@@ -12395,7 +12395,7 @@
         <w:pStyle w:val="BodyText"/>
       </w:pPr>
       <w:r>
-        <w:t xml:space="preserve">If a model-based constant is wanted, a tiltmeter on the monolithic pier T7 is the most informative additional measurement; under the side-span convoy it would read about 167 µrad. At calibration A (</w:t>
+        <w:t xml:space="preserve">If a model-based constant is wanted, a tiltmeter on the monolithic pier T7 is the most informative additional measurement; under the four trucks of the side-span test load it would read about 167 µrad. At calibration A (</w:t>
       </w:r>
       <m:oMath>
         <m:r>
@@ -13767,7 +13767,7 @@
         <w:pStyle w:val="BodyText"/>
       </w:pPr>
       <w:r>
-        <w:t xml:space="preserve">Ojio T and Yamada K (2002) Bridge weigh-in-motion systems using stringers of plate girder bridges, in: Proceedings of the Third International Conference on Weigh-in-Motion (ICWIM3). Orlando, FL, pp. 209–218.</w:t>
+        <w:t xml:space="preserve">Ojio T and Yamada K (2002) Bridge weigh-in-motion systems using stringers of plate girder bridges. In: Proceedings of the Third International Conference on Weigh-in-Motion (ICWIM3). Orlando, FL, pp. 209–218.</w:t>
       </w:r>
     </w:p>
     <w:p>

</xml_diff>

<commit_message>
ASE: XII.13 round 4 mandatory fixes (P estimate wording, Cramér–Rao phrasing)
Co-Authored-By: Claude Opus 5.5 <noreply@anthropic.com>
Claude-Session: https://claude.ai/code/session_01LGLpDzAMfdMgWcXQjLxauw
</commit_message>
<xml_diff>
--- a/manuscript/ase/word/Manuscript_ASE.docx
+++ b/manuscript/ase/word/Manuscript_ASE.docx
@@ -214,7 +214,7 @@
         <w:t xml:space="preserve"> </w:t>
       </w:r>
       <w:r>
-        <w:t xml:space="preserve">at mid-span of two equal spans), yet every continuous girder has strain blind points. (ii) We derive a placement rule, optimal sensors at the extremes of the uniform-load response, and show on one day of public moving-truck records that GLS weights built from vehicle-free noise raise the out-of-sample error above that of the gauge average (20.4 % against 11.9 % of gross weight). (iii) We show that the integral constant depends on pier stiffness through a linear-fractional (Möbius) law and, on an in-service box girder, that two static readings leave a side-span deflection constant uncertain by a factor of 6.6, while a pier tiltmeter would reduce the Cramér–Rao bound on its logarithm from 0.87 to 0.18.</w:t>
+        <w:t xml:space="preserve">at mid-span of two equal spans), yet every continuous girder has strain blind points. (ii) We derive a placement rule, optimal sensors at the extremes of the uniform-load response, and show on one day of public moving-truck records that GLS weights built from vehicle-free noise raise the out-of-sample error above that of the gauge average (20.4 % against 11.9 % of gross weight). (iii) We show that the integral constant depends on pier stiffness through a linear-fractional (Möbius) law and, on an in-service box girder, that two static readings leave a side-span deflection constant uncertain by a factor of 6.6, while a pier tiltmeter would reduce the Cramér–Rao bound on the standard deviation of its logarithm from 0.87 to 0.18.</w:t>
       </w:r>
     </w:p>
     <w:bookmarkEnd w:id="21"/>
@@ -1570,7 +1570,7 @@
         <w:t xml:space="preserve"> </w:t>
       </w:r>
       <w:r>
-        <w:t xml:space="preserve">from a structural model and returns the total-load estimate</w:t>
+        <w:t xml:space="preserve">from a structural model and returns the estimate</w:t>
       </w:r>
       <w:r>
         <w:t xml:space="preserve"> </w:t>
@@ -1597,6 +1597,44 @@
         <m:r>
           <m:t>C</m:t>
         </m:r>
+      </m:oMath>
+      <w:r>
+        <w:t xml:space="preserve"> </w:t>
+      </w:r>
+      <w:r>
+        <w:t xml:space="preserve">of</w:t>
+      </w:r>
+      <w:r>
+        <w:t xml:space="preserve"> </w:t>
+      </w:r>
+      <m:oMath>
+        <m:sSub>
+          <m:e>
+            <m:r>
+              <m:t>P</m:t>
+            </m:r>
+          </m:e>
+          <m:sub>
+            <m:r>
+              <m:rPr>
+                <m:sty m:val="p"/>
+              </m:rPr>
+              <m:t>t</m:t>
+            </m:r>
+            <m:r>
+              <m:rPr>
+                <m:sty m:val="p"/>
+              </m:rPr>
+              <m:t>o</m:t>
+            </m:r>
+            <m:r>
+              <m:rPr>
+                <m:sty m:val="p"/>
+              </m:rPr>
+              <m:t>t</m:t>
+            </m:r>
+          </m:sub>
+        </m:sSub>
       </m:oMath>
       <w:r>
         <w:t xml:space="preserve">; SLM takes the constant from a reference crossing of known weight</w:t>
@@ -13300,7 +13338,7 @@
         <w:pStyle w:val="BodyText"/>
       </w:pPr>
       <w:r>
-        <w:t xml:space="preserve">The constant is a linear-fractional (Möbius) function of the scaled pier stiffness. On a 55 + 90 + 55 m box girder, two static readings leave the side-span deflection constant uncertain by a factor of 6.6, whereas the main-span constant is well determined; a pier tiltmeter would reduce the Cramér–Rao bound on</w:t>
+        <w:t xml:space="preserve">The constant is a linear-fractional (Möbius) function of the scaled pier stiffness. On a 55 + 90 + 55 m box girder, two static readings leave the side-span deflection constant uncertain by a factor of 6.6, whereas the main-span constant is well determined; a pier tiltmeter would reduce the Cramér–Rao bound on the standard deviation of</w:t>
       </w:r>
       <w:r>
         <w:t xml:space="preserve"> </w:t>

</xml_diff>

<commit_message>
ASE: final readability fixes, submission checklist; package frozen pending submission date
Co-Authored-By: Claude Opus 5.5 <noreply@anthropic.com>
Claude-Session: https://claude.ai/code/session_01LGLpDzAMfdMgWcXQjLxauw
</commit_message>
<xml_diff>
--- a/manuscript/ase/word/Manuscript_ASE.docx
+++ b/manuscript/ase/word/Manuscript_ASE.docx
@@ -90,7 +90,7 @@
         <w:pStyle w:val="FirstParagraph"/>
       </w:pPr>
       <w:r>
-        <w:t xml:space="preserve">On a continuous girder the influence line of a channel changes sign over the piers, so the area under a record, which gives the total load in influence-area weighing, can vanish. This paper gives criteria for choosing, before installation, channels that observe the total load. Closed forms give the blind loci, where this area vanishes, of five channel types on continuous and haunched girders; strain gauges are blind at every zero of the uniform-load moment and nearly blind in a band that can contain gauges set back from the piers. Optimal sensors lie at the extremes of the uniform-load response, and the integral constant (record integral per unit total load) follows a linear-fractional (Möbius) law in the scaled pier stiffness. A laboratory test confirms the identity. Public moving-truck records, whose reference weights vary too little to test weight discrimination, are consistent with the assumptions of the identity within margins of 10–27 % and show that vehicle-free noise covariance misleads multi-channel weighting. On an in-service box girder, two static readings leave a side-span deflection constant uncertain by a factor of 6.6, whereas the main-span constant is well determined.</w:t>
+        <w:t xml:space="preserve">On a continuous girder the influence line of a channel changes sign over the piers, so the area under a record, which gives the total load in influence-area weighing, can vanish. This paper gives criteria for choosing, before installation, channels that observe the total load. Closed forms give the blind loci, where this area vanishes, of five channel types on continuous and haunched girders; strain gauges are blind at every zero of the uniform-load moment and nearly blind in a band that can contain gauges set back from the piers. Optimal sensors lie at the extremes of the uniform-load response, and the integral constant (record integral per unit total load) follows a linear-fractional (Möbius) law in the scaled pier stiffness. A laboratory test is consistent with the identity. Public moving-truck records, whose reference weights vary too little to test weight discrimination, are consistent with the assumptions of the identity within margins of 10–27 % and show that vehicle-free noise covariance misleads multi-channel weighting. On an in-service box girder, two static readings leave a side-span deflection constant uncertain by a factor of 6.6, whereas the main-span constant is well determined.</w:t>
       </w:r>
     </w:p>
     <w:p>
@@ -1036,6 +1036,44 @@
         <m:sSub>
           <m:e>
             <m:r>
+              <m:t>d</m:t>
+            </m:r>
+          </m:e>
+          <m:sub>
+            <m:r>
+              <m:rPr>
+                <m:sty m:val="p"/>
+              </m:rPr>
+              <m:t>m</m:t>
+            </m:r>
+            <m:r>
+              <m:rPr>
+                <m:sty m:val="p"/>
+              </m:rPr>
+              <m:t>a</m:t>
+            </m:r>
+            <m:r>
+              <m:rPr>
+                <m:sty m:val="p"/>
+              </m:rPr>
+              <m:t>x</m:t>
+            </m:r>
+          </m:sub>
+        </m:sSub>
+      </m:oMath>
+      <w:r>
+        <w:t xml:space="preserve"> </w:t>
+      </w:r>
+      <w:r>
+        <w:t xml:space="preserve">is the largest axle offset,</w:t>
+      </w:r>
+      <w:r>
+        <w:t xml:space="preserve"> </w:t>
+      </w:r>
+      <m:oMath>
+        <m:sSub>
+          <m:e>
+            <m:r>
               <m:t>P</m:t>
             </m:r>
           </m:e>
@@ -1065,7 +1103,7 @@
         <w:t xml:space="preserve"> </w:t>
       </w:r>
       <w:r>
-        <w:t xml:space="preserve">is the total load and</w:t>
+        <w:t xml:space="preserve">the total load and</w:t>
       </w:r>
       <w:r>
         <w:t xml:space="preserve"> </w:t>
@@ -1762,7 +1800,7 @@
         <w:t xml:space="preserve"> </w:t>
       </w:r>
       <w:r>
-        <w:t xml:space="preserve">is defined (so each lane has its own constant), a complete crossing and re-zeroing to the unloaded state; Sections 3, 4 and 6 test these assumptions, and truncating the record when the first axle leaves changes the rotation integral by up to 59 % on a two-span example (Supplementary Section S3).</w:t>
+        <w:t xml:space="preserve">is defined (so each lane has its own constant), a complete crossing and re-zeroing to the unloaded state; Sections 3, 4 and 6 test these assumptions. The complete crossing matters: truncating the record when the first axle leaves changes the rotation integral by up to 59 % on a two-span example (Supplementary Section S3).</w:t>
       </w:r>
     </w:p>
     <w:bookmarkEnd w:id="22"/>
@@ -3738,7 +3776,7 @@
         <w:pStyle w:val="BodyText"/>
       </w:pPr>
       <w:r>
-        <w:t xml:space="preserve">The locus ends at</w:t>
+        <w:t xml:space="preserve">The blind locus over all side-span positions ends at</w:t>
       </w:r>
       <w:r>
         <w:t xml:space="preserve"> </w:t>
@@ -5427,7 +5465,7 @@
               </m:r>
             </m:oMath>
             <w:r>
-              <w:t xml:space="preserve">; locus ends at</w:t>
+              <w:t xml:space="preserve">; locus over all side-span positions ends at</w:t>
             </w:r>
             <w:r>
               <w:t xml:space="preserve"> </w:t>
@@ -9889,7 +9927,7 @@
         <w:pStyle w:val="BodyText"/>
       </w:pPr>
       <w:r>
-        <w:t xml:space="preserve">The analytical influence line matched the single-load record within 0.0126 mm, 0.44 % of the peak. With the trapezoidal rule, BPM overestimated the weighed totals of 66.99 N and 125.08 N by 1.10 % and 1.19 %, and SLM by 0.61 % and 0.70 % (Supplementary Table S3). The BPM-to-SLM ratio equals 1.0049, the ratio of the measured reference integral to its exact value: SLM absorbs the calibration error of the reference record, whereas BPM does not. The SLM deviations match the growth of the measured-to-analytical integral ratio (1.010, 1.016 and 1.017 for one, two and three loads), which the data cannot attribute to support seating or to the stated masses. The test supports the invariance of Eq. (2) only indirectly, and the predicted blind configuration (spans of 2500 mm and 3644 mm) was not tested.</w:t>
+        <w:t xml:space="preserve">The analytical influence line matched the single-load record within 0.0126 mm, 0.44 % of the peak. With the trapezoidal rule, BPM overestimated the weighed totals of 66.99 N and 125.08 N by 1.10 % and 1.19 %, and SLM by 0.61 % and 0.70 % (Supplementary Table S3). The BPM-to-SLM ratio equals 1.0049, the ratio of the measured reference integral to its exact value: SLM absorbs the calibration error of the reference record, whereas BPM does not. The SLM deviations match the growth of the measured-to-analytical integral ratio (1.010, 1.016 and 1.017 for one, two and three loads), which the data cannot assign to either support seating or the stated masses. The test supports the invariance of Eq. (2) only indirectly, and the predicted blind configuration (spans of 2500 mm and 3644 mm) was not tested.</w:t>
       </w:r>
     </w:p>
     <w:bookmarkEnd w:id="28"/>

</xml_diff>

<commit_message>
ASE: XII.13 rounds 6-8 fixes (span symbol L, cutoff, mean-weight predictor, Table S4 zeros, clearer sentences), status docs and checklist updated; package rebuilt for 20 October 2026 submission
Co-Authored-By: Claude Opus 5.5 <noreply@anthropic.com>
Claude-Session: https://claude.ai/code/session_01B18ehnY6ZEjmwZNzrTta57
</commit_message>
<xml_diff>
--- a/manuscript/ase/word/Manuscript_ASE.docx
+++ b/manuscript/ase/word/Manuscript_ASE.docx
@@ -140,7 +140,7 @@
         <w:pStyle w:val="BodyText"/>
       </w:pPr>
       <w:r>
-        <w:t xml:space="preserve">This paper supplies such criteria. Neither the influence-area identity nor the generalized least-squares (GLS) estimator is new; the contributions lie in the criteria built on them. (i) We derive a closed-form catalog of blind loci for five channel types on two- and three-span and haunched girders, with two indicators that need no reference rigidity; at every prismatic location examined, strain influence lines cancel less than deflection influence lines (cancellation ratio</w:t>
+        <w:t xml:space="preserve">This paper supplies such criteria. Neither the influence-area identity nor the generalized least-squares (GLS) estimator is new; the contributions lie in the criteria built on them. (i) We derive a closed-form catalog of blind loci for five channel types on two- and three-span and haunched girders, with two indicators that need no reference rigidity. At every prismatic location examined, strain influence lines cancel less than deflection influence lines, yet every continuous girder has strain blind points; at mid-span of two equal spans the cancellation ratio, the net influence area divided by its positive part, is</w:t>
       </w:r>
       <w:r>
         <w:t xml:space="preserve"> </w:t>
@@ -172,7 +172,7 @@
         <w:t xml:space="preserve"> </w:t>
       </w:r>
       <w:r>
-        <w:t xml:space="preserve">against</w:t>
+        <w:t xml:space="preserve">for strain against</w:t>
       </w:r>
       <w:r>
         <w:t xml:space="preserve"> </w:t>
@@ -204,7 +204,7 @@
         <w:t xml:space="preserve"> </w:t>
       </w:r>
       <w:r>
-        <w:t xml:space="preserve">at mid-span of two equal spans), yet every continuous girder has strain blind points. (ii) We derive a placement rule, optimal sensors at the extremes of the uniform-load response, and show on one day of public moving-truck records that GLS weights built from vehicle-free noise raise the out-of-sample error above that of the gauge average (20.4 % against 11.9 % of gross weight). (iii) We show that the integral constant depends on pier stiffness through a linear-fractional (Möbius) law and, on an in-service box girder, that two static readings leave a side-span deflection constant uncertain by a factor of 6.6, while a pier tiltmeter would reduce the Cramér–Rao bound on the standard deviation of its logarithm from 0.87 to 0.18.</w:t>
+        <w:t xml:space="preserve">for deflection. (ii) We derive a placement rule, optimal sensors at the extremes of the uniform-load response, and show on one day of public moving-truck records that GLS weights built from vehicle-free noise raise the out-of-sample error above that of the gauge average (20.4 % against 11.9 % of gross weight). (iii) We show that the integral constant depends on pier stiffness through a linear-fractional (Möbius) law and, on an in-service box girder, that two static readings leave a side-span deflection constant uncertain by a factor of 6.6, while a pier tiltmeter would reduce the Cramér–Rao bound on the standard deviation of its logarithm from 0.87 to 0.18.</w:t>
       </w:r>
     </w:p>
     <w:bookmarkEnd w:id="21"/>
@@ -1766,7 +1766,7 @@
         <w:t xml:space="preserve"> </w:t>
       </w:r>
       <w:r>
-        <w:t xml:space="preserve">is defined (so each lane has its own constant), a complete crossing and re-zeroing to the unloaded state; Sections 3, 4 and 6 test these assumptions. The complete crossing matters: truncating the record when the first axle leaves changes the rotation integral by up to 59 % on a two-span example (Supplementary Section S3).</w:t>
+        <w:t xml:space="preserve">is defined (so each lane has its own constant), a complete crossing and re-zeroing to the unloaded state; Sections 3 and 4 test these assumptions, and Section 6 discusses their limits. The complete crossing matters: truncating the record when the first axle leaves changes the rotation integral by up to 59 % on a two-span example (Supplementary Section S3).</w:t>
       </w:r>
     </w:p>
     <w:bookmarkEnd w:id="22"/>
@@ -10484,7 +10484,7 @@
         <m:sSup>
           <m:e>
             <m:r>
-              <m:t>l</m:t>
+              <m:t>L</m:t>
             </m:r>
           </m:e>
           <m:sup>
@@ -10536,7 +10536,7 @@
       </w:r>
       <m:oMath>
         <m:r>
-          <m:t>l</m:t>
+          <m:t>L</m:t>
         </m:r>
       </m:oMath>
       <w:r>
@@ -10780,7 +10780,7 @@
         <w:t xml:space="preserve"> </w:t>
       </w:r>
       <w:r>
-        <w:t xml:space="preserve">test does not reject consistency with the measured noise for eight of the twelve gauges, but only ch11 shows equal constants for both trucks within ±10 % (Fig. 5a); with twelve tests at the 5 % level, one such pass is about what chance alone would produce. The four gauges without axle spikes give constants 22–26 % lower for the second truck (CIs exclude 1), but speed and truck are almost perfectly confounded on day 1 (correlation 0.98), so wheel path, local deck action or speed may cause this. On day 2, the ratio of the gauge-average constants of the 5-axle and the 3-axle truck is 0.98 (95 % CI 0.70–1.37; Fig. 5b): consistent with Eq. (2), but with eight runs it cannot exclude differences of up to about 27 %, so it is a coarse check of linearity and processing. A speed effect was neither resolved nor excluded (Supplementary Fig. S11).</w:t>
+        <w:t xml:space="preserve">test does not reject consistency with the measured noise for eight of the twelve gauges, but only ch11 shows equal constants for both trucks within ±10 % (Fig. 5a); with twelve tests at the 5 % level, one gauge passing this ±10 % check is about what chance alone would produce. The four gauges without axle spikes give constants 22–26 % lower for the second truck (CIs exclude 1), but speed and truck are almost perfectly confounded on day 1 (correlation 0.98), so wheel path, local deck action or speed may cause this. On day 2, the ratio of the gauge-average constants of the 5-axle and the 3-axle truck is 0.98 (95 % CI 0.70–1.37; Fig. 5b): consistent with Eq. (2), but with eight runs it cannot exclude differences of up to about 27 %, so it is a coarse check of linearity and processing. A speed effect was neither resolved nor excluded (Supplementary Fig. S11).</w:t>
       </w:r>
     </w:p>
     <w:p>
@@ -10853,7 +10853,7 @@
         <w:pStyle w:val="BodyText"/>
       </w:pPr>
       <w:r>
-        <w:t xml:space="preserve">Each lane needs its own constant. For the gauge average, return trips in lane B gave constants 0.79 times those of lane A (95 % CI 0.59–1.00), as on another continuous girder (Wu et al., 2020); lane-B speeds came from the lag between gauges, so this ratio also contains any difference between the two speed estimates. The lane effect is clearly resolved for one gauge only (st36: 0.64, 95 % CI 0.47–0.81). For the gauge average, the two runs with the trucks one behind the other gave 0.92 of the summed single-truck predictions (pooled 95 % CI 0.77–1.06), consistent with superposition although both fall below the prediction.</w:t>
+        <w:t xml:space="preserve">Each lane needs its own constant. For the gauge average, return trips in lane B gave constants 0.79 times those of lane A (95 % CI 0.59–1.00), as on another continuous girder (Wu et al., 2020); lane-B speeds came from the lag between gauges, so this ratio also contains any difference between the two speed estimates. The lane effect is clearly resolved for one gauge only (st36: 0.64, 95 % CI 0.47–0.81). For the gauge average, the two runs with the trucks one behind the other gave 0.92 of the summed single-truck predictions (pooled 95 % CI 0.77–1.06), consistent with superposition although both runs fall below the prediction.</w:t>
       </w:r>
     </w:p>
     <w:p>
@@ -11199,7 +11199,7 @@
               <w:jc w:val="left"/>
             </w:pPr>
             <w:r>
-              <w:t xml:space="preserve">Mean weight of the calibration runs</w:t>
+              <w:t xml:space="preserve">Mean-weight predictor (mean of the calibration runs)</w:t>
             </w:r>
           </w:p>
         </w:tc>
@@ -11794,7 +11794,7 @@
         <w:pStyle w:val="FirstParagraph"/>
       </w:pPr>
       <w:r>
-        <w:t xml:space="preserve">The static data leave the constant of the side-span gauge N8 uncertain by a factor of 6.6, whereas that of the main-span gauge N7 is well determined, because of a model-form misfit and the Möbius law of Eq. (15).</w:t>
+        <w:t xml:space="preserve">Because of a model-form misfit and the Möbius law of Eq. (15), the static data leave the constant of the side-span gauge N8 uncertain by a factor of 6.6, whereas that of the main-span gauge N7 is well determined.</w:t>
       </w:r>
     </w:p>
     <w:p>
@@ -13653,7 +13653,27 @@
         </m:d>
       </m:oMath>
       <w:r>
-        <w:t xml:space="preserve">, disagrees. Which ranking governs depends on whether the strain resolution or the offset sets the noise. Load cells under the end bearings (</w:t>
+        <w:t xml:space="preserve">, disagrees with the ranking by</w:t>
+      </w:r>
+      <w:r>
+        <w:t xml:space="preserve"> </w:t>
+      </w:r>
+      <m:oMath>
+        <m:sSub>
+          <m:e>
+            <m:r>
+              <m:t>N</m:t>
+            </m:r>
+          </m:e>
+          <m:sub>
+            <m:r>
+              <m:t>M</m:t>
+            </m:r>
+          </m:sub>
+        </m:sSub>
+      </m:oMath>
+      <w:r>
+        <w:t xml:space="preserve">. Which ranking governs depends on whether the strain resolution or the offset sets the noise. Load cells under the end bearings (</w:t>
       </w:r>
       <m:oMath>
         <m:sSub>
@@ -14757,7 +14777,7 @@
         <w:pStyle w:val="FirstParagraph"/>
       </w:pPr>
       <w:r>
-        <w:t xml:space="preserve">The authors gratefully acknowledge the Laboratory of Transportation Technology and Systems, Faculty of Bridge and Road Engineering, Hanoi University of Civil Engineering, for providing the test facilities used in this study, and A. Moghadam and R. Sarlo for making the NOR-BWIM dataset publicly available. They also thank the Hải Dương provincial project management unit and Công ty TNHH Tư vấn Đại học Xây dựng for permission to use the acceptance-test data of the Cầu Mây Bridge.</w:t>
+        <w:t xml:space="preserve">The authors gratefully acknowledge the Laboratory of Transportation Technology and Systems, Faculty of Bridge and Road Engineering, Hanoi University of Civil Engineering, for providing the test facilities used in this study, and A. Moghadam and R. Sarlo for making the NOR-BWIM dataset publicly available. They also thank the Hải Dương provincial project management unit and Công ty TNHH Tư vấn Đại học Xây dựng (HUCE consultancy) for permission to use the acceptance-test data of the Cầu Mây Bridge.</w:t>
       </w:r>
     </w:p>
     <w:p>

</xml_diff>

<commit_message>
ASE: rename Cầu Mây to Mây Bridge in text and figure labels (Figs 2, 3, S2, S5, S6 redrawn from their scripts; graphical abstract rebuilt)
Co-Authored-By: Claude Opus 5.5 <noreply@anthropic.com>
Claude-Session: https://claude.ai/code/session_01B18ehnY6ZEjmwZNzrTta57
</commit_message>
<xml_diff>
--- a/manuscript/ase/word/Manuscript_ASE.docx
+++ b/manuscript/ase/word/Manuscript_ASE.docx
@@ -4329,7 +4329,7 @@
         <w:t xml:space="preserve"> </w:t>
       </w:r>
       <w:r>
-        <w:t xml:space="preserve">(dashed) and Cầu Mây proportions with a mid side-span sensor (circle); (b) asymmetric beam, sensor at mid-span of span 1, over</w:t>
+        <w:t xml:space="preserve">(dashed) and Mây Bridge proportions with a mid side-span sensor (circle); (b) asymmetric beam, sensor at mid-span of span 1, over</w:t>
       </w:r>
       <w:r>
         <w:t xml:space="preserve"> </w:t>
@@ -11310,7 +11310,7 @@
         <w:pStyle w:val="FirstParagraph"/>
       </w:pPr>
       <w:r>
-        <w:t xml:space="preserve">The Cầu Mây Bridge crosses the Kinh Môn River in Hải Dương, Viet Nam. Its main bridge is a 55 + 90 + 55 m continuous prestressed concrete box girder built by balanced cantilever (</w:t>
+        <w:t xml:space="preserve">The Mây Bridge crosses the Kinh Môn River in Hải Dương, Viet Nam. Its main bridge is a 55 + 90 + 55 m continuous prestressed concrete box girder built by balanced cantilever (</w:t>
       </w:r>
       <m:oMath>
         <m:r>
@@ -11693,7 +11693,7 @@
         <w:t xml:space="preserve"> </w:t>
       </w:r>
       <w:r>
-        <w:t xml:space="preserve">Cầu Mây girder: indicators for a prismatic model with pinned piers and for the haunched model under calibrations A and B: (a) deflection</w:t>
+        <w:t xml:space="preserve">Mây Bridge girder: indicators for a prismatic model with pinned piers and for the haunched model under calibrations A and B: (a) deflection</w:t>
       </w:r>
       <w:r>
         <w:t xml:space="preserve"> </w:t>
@@ -11910,7 +11910,7 @@
         <w:t xml:space="preserve"> </w:t>
       </w:r>
       <w:r>
-        <w:t xml:space="preserve">Identifiability of the Cầu Mây pier stiffness: (a) misfit ratio</w:t>
+        <w:t xml:space="preserve">Identifiability of the Mây Bridge pier stiffness: (a) misfit ratio</w:t>
       </w:r>
       <w:r>
         <w:t xml:space="preserve"> </w:t>
@@ -12541,7 +12541,7 @@
         </m:r>
       </m:oMath>
       <w:r>
-        <w:t xml:space="preserve">, Eq. (11), of the installed Cầu Mây gauges;</w:t>
+        <w:t xml:space="preserve">, Eq. (11), of the installed Mây Bridge gauges;</w:t>
       </w:r>
       <w:r>
         <w:t xml:space="preserve"> </w:t>
@@ -13939,7 +13939,7 @@
         <w:t xml:space="preserve"> </w:t>
       </w:r>
       <w:r>
-        <w:t xml:space="preserve">Predicted discriminating measurements at Cầu Mây for a 25 t 3-axle truck (predictions, not measured).</w:t>
+        <w:t xml:space="preserve">Predicted discriminating measurements at the Mây Bridge for a 25 t 3-axle truck (predictions, not measured).</w:t>
       </w:r>
     </w:p>
     <w:tbl>
@@ -14356,7 +14356,7 @@
         <w:pStyle w:val="BodyText"/>
       </w:pPr>
       <w:r>
-        <w:t xml:space="preserve">The residual offset limits single-channel accuracy on long spans. Over the Cầu Mây admissible set, with</w:t>
+        <w:t xml:space="preserve">The residual offset limits single-channel accuracy on long spans. Over the Mây Bridge admissible set, with</w:t>
       </w:r>
       <w:r>
         <w:t xml:space="preserve"> </w:t>
@@ -14777,7 +14777,7 @@
         <w:pStyle w:val="FirstParagraph"/>
       </w:pPr>
       <w:r>
-        <w:t xml:space="preserve">The authors gratefully acknowledge the Laboratory of Transportation Technology and Systems, Faculty of Bridge and Road Engineering, Hanoi University of Civil Engineering, for providing the test facilities used in this study, and A. Moghadam and R. Sarlo for making the NOR-BWIM dataset publicly available. They also thank the Hải Dương provincial project management unit and Công ty TNHH Tư vấn Đại học Xây dựng (HUCE consultancy) for permission to use the acceptance-test data of the Cầu Mây Bridge.</w:t>
+        <w:t xml:space="preserve">The authors gratefully acknowledge the Laboratory of Transportation Technology and Systems, Faculty of Bridge and Road Engineering, Hanoi University of Civil Engineering, for providing the test facilities used in this study, and A. Moghadam and R. Sarlo for making the NOR-BWIM dataset publicly available. They also thank the Hải Dương provincial project management unit and Công ty TNHH Tư vấn Đại học Xây dựng (HUCE consultancy) for permission to use the acceptance-test data of the Mây Bridge.</w:t>
       </w:r>
     </w:p>
     <w:p>
@@ -14884,7 +14884,7 @@
         <w:pStyle w:val="FirstParagraph"/>
       </w:pPr>
       <w:r>
-        <w:t xml:space="preserve">The Cầu Mây load test analyzed in Section 5 was performed by an author of this paper (Q.-B. Nguyen) as part of inspection work carried out by Công ty TNHH Tư vấn Đại học Xây dựng (HUCE consultancy). The authors declare that there is no other conflict of interest regarding the publication of this article.</w:t>
+        <w:t xml:space="preserve">The Mây Bridge load test analyzed in Section 5 was performed by an author of this paper (Q.-B. Nguyen) as part of inspection work carried out by Công ty TNHH Tư vấn Đại học Xây dựng (HUCE consultancy). The authors declare that there is no other conflict of interest regarding the publication of this article.</w:t>
       </w:r>
     </w:p>
     <w:bookmarkEnd w:id="65"/>
@@ -14920,7 +14920,7 @@
         <w:pStyle w:val="FirstParagraph"/>
       </w:pPr>
       <w:r>
-        <w:t xml:space="preserve">The field strain records analyzed in Section 4 are publicly available in the NOR-BWIM dataset (figshare, https://doi.org/10.7294/26880898.v1, CC0; Moghadam and Sarlo, 2024). The Cầu Mây load test was performed by an author of this paper, and the authors are permitted to publish the processed data. The laboratory and Cầu Mây data, the analysis scripts with the console output of each run, and the derived data behind every figure and table are provided as Supplementary Material. Every equation and numerical output was checked independently against an analytical, finite element or convergence-based route.</w:t>
+        <w:t xml:space="preserve">The field strain records analyzed in Section 4 are publicly available in the NOR-BWIM dataset (figshare, https://doi.org/10.7294/26880898.v1, CC0; Moghadam and Sarlo, 2024). The Mây Bridge load test was performed by an author of this paper, and the authors are permitted to publish the processed data. The laboratory and Mây Bridge data, the analysis scripts with the console output of each run, and the derived data behind every figure and table are provided as Supplementary Material. Every equation and numerical output was checked independently against an analytical, finite element or convergence-based route.</w:t>
       </w:r>
     </w:p>
     <w:bookmarkEnd w:id="67"/>

</xml_diff>

<commit_message>
ASE: fix final blind-read items (P_tot symbol, pier-rotation pattern, author name)
Co-Authored-By: Claude Opus 5.5 <noreply@anthropic.com>
Claude-Session: https://claude.ai/code/session_01B18ehnY6ZEjmwZNzrTta57
</commit_message>
<xml_diff>
--- a/manuscript/ase/word/Manuscript_ASE.docx
+++ b/manuscript/ase/word/Manuscript_ASE.docx
@@ -7968,9 +7968,21 @@
         <m:r>
           <m:t>C</m:t>
         </m:r>
-        <m:r>
-          <m:t>P</m:t>
-        </m:r>
+        <m:sSub>
+          <m:e>
+            <m:r>
+              <m:t>P</m:t>
+            </m:r>
+          </m:e>
+          <m:sub>
+            <m:r>
+              <m:rPr>
+                <m:sty m:val="p"/>
+              </m:rPr>
+              <m:t>tot</m:t>
+            </m:r>
+          </m:sub>
+        </m:sSub>
       </m:oMath>
       <w:r>
         <w:t xml:space="preserve"> </w:t>
@@ -8067,9 +8079,21 @@
                     </m:sSub>
                   </m:num>
                   <m:den>
-                    <m:r>
-                      <m:t>P</m:t>
-                    </m:r>
+                    <m:sSub>
+                      <m:e>
+                        <m:r>
+                          <m:t>P</m:t>
+                        </m:r>
+                      </m:e>
+                      <m:sub>
+                        <m:r>
+                          <m:rPr>
+                            <m:sty m:val="p"/>
+                          </m:rPr>
+                          <m:t>tot</m:t>
+                        </m:r>
+                      </m:sub>
+                    </m:sSub>
                   </m:den>
                 </m:f>
                 <m:r>
@@ -8257,9 +8281,21 @@
             </m:r>
           </m:sub>
         </m:sSub>
-        <m:r>
-          <m:t>P</m:t>
-        </m:r>
+        <m:sSub>
+          <m:e>
+            <m:r>
+              <m:t>P</m:t>
+            </m:r>
+          </m:e>
+          <m:sub>
+            <m:r>
+              <m:rPr>
+                <m:sty m:val="p"/>
+              </m:rPr>
+              <m:t>tot</m:t>
+            </m:r>
+          </m:sub>
+        </m:sSub>
         <m:r>
           <m:rPr>
             <m:sty m:val="p"/>
@@ -9435,7 +9471,7 @@
         </m:d>
       </m:oMath>
       <w:r>
-        <w:t xml:space="preserve">; with correlated offsets one should sit at the minimum, because a common offset cancels in the difference. A brute-force search and a Monte Carlo study (Eqs. (11) and (12) within 0.6 %) confirm this (Supplementary Section S4). The zero-sum estimator helps only if the disturbance is common-mode during the crossings themselves, not merely in vehicle-free periods, and Section 4.3 shows that real records can violate this.</w:t>
+        <w:t xml:space="preserve">; with correlated offsets one sensor should sit at the minimum, because a common offset cancels in the difference. A brute-force search and a Monte Carlo study (Eqs. (11) and (12) within 0.6 %) confirm this (Supplementary Section S4). The zero-sum estimator helps only if the disturbance is common-mode during the crossings themselves, not merely in vehicle-free periods, and Section 4.3 shows that real records can violate this.</w:t>
       </w:r>
     </w:p>
     <w:bookmarkEnd w:id="34"/>
@@ -13101,7 +13137,7 @@
         <w:t xml:space="preserve"> </w:t>
       </w:r>
       <w:r>
-        <w:t xml:space="preserve">= 5.3 %, two standard deviations of a section mean that combine measurement and model-form error (Supplementary Section S8). At this tolerance the data bound</w:t>
+        <w:t xml:space="preserve">= 5.3 %, two combined standard uncertainties (measurement and model form) of a section mean (Supplementary Section S8). At this tolerance the data bound</w:t>
       </w:r>
       <w:r>
         <w:t xml:space="preserve"> </w:t>
@@ -15543,7 +15579,7 @@
         <w:jc w:val="left"/>
       </w:pPr>
       <w:r>
-        <w:t xml:space="preserve">Agüero-Barrantes P, Christenson RE and Lobo-Aguilar S (2023) Utilizing Kriging metamodeling to provide practical and effective bridge weigh-in-motion. Journal of Bridge Engineering 28(2): 04022138. DOI: 10.1061/JBENF2.BEENG-5760.</w:t>
+        <w:t xml:space="preserve">Agüero-Barrantes P, Christenson RE and Lobo Aguilar S (2023) Utilizing Kriging metamodeling to provide practical and effective bridge weigh-in-motion. Journal of Bridge Engineering 28(2): 04022138. DOI: 10.1061/JBENF2.BEENG-5760.</w:t>
       </w:r>
     </w:p>
     <w:p>

</xml_diff>

<commit_message>
ASE build: render operator-only scripts and lone bars as normal text so LibreOffice PDFs show no error glyphs; add hostile audit v2 reports so far
Co-Authored-By: Claude Opus 5.5 <noreply@anthropic.com>
Claude-Session: https://claude.ai/code/session_01B18ehnY6ZEjmwZNzrTta57
</commit_message>
<xml_diff>
--- a/manuscript/ase/word/Manuscript_ASE.docx
+++ b/manuscript/ase/word/Manuscript_ASE.docx
@@ -706,7 +706,7 @@
             <m:oMath>
               <m:r>
                 <m:rPr>
-                  <m:sty m:val="p"/>
+                  <m:nor/>
                 </m:rPr>
                 <m:t>|</m:t>
               </m:r>
@@ -757,7 +757,7 @@
               </m:r>
               <m:r>
                 <m:rPr>
-                  <m:sty m:val="p"/>
+                  <m:nor/>
                 </m:rPr>
                 <m:t>|</m:t>
               </m:r>
@@ -4461,7 +4461,7 @@
           <m:sup>
             <m:r>
               <m:rPr>
-                <m:sty m:val="p"/>
+                <m:nor/>
               </m:rPr>
               <m:t>*</m:t>
             </m:r>
@@ -7528,7 +7528,7 @@
                       <m:sup>
                         <m:r>
                           <m:rPr>
-                            <m:sty m:val="p"/>
+                            <m:nor/>
                           </m:rPr>
                           <m:t>+</m:t>
                         </m:r>
@@ -7573,7 +7573,7 @@
                           <m:sup>
                             <m:r>
                               <m:rPr>
-                                <m:sty m:val="p"/>
+                                <m:nor/>
                               </m:rPr>
                               <m:t>−</m:t>
                             </m:r>
@@ -7592,7 +7592,7 @@
                       <m:sup>
                         <m:r>
                           <m:rPr>
-                            <m:sty m:val="p"/>
+                            <m:nor/>
                           </m:rPr>
                           <m:t>+</m:t>
                         </m:r>
@@ -7646,7 +7646,7 @@
           <m:sup>
             <m:r>
               <m:rPr>
-                <m:sty m:val="p"/>
+                <m:nor/>
               </m:rPr>
               <m:t>+</m:t>
             </m:r>
@@ -7729,7 +7729,7 @@
           <m:sup>
             <m:r>
               <m:rPr>
-                <m:sty m:val="p"/>
+                <m:nor/>
               </m:rPr>
               <m:t>+</m:t>
             </m:r>
@@ -7755,7 +7755,7 @@
           <m:sup>
             <m:r>
               <m:rPr>
-                <m:sty m:val="p"/>
+                <m:nor/>
               </m:rPr>
               <m:t>−</m:t>
             </m:r>
@@ -8544,7 +8544,7 @@
                   <m:sup>
                     <m:r>
                       <m:rPr>
-                        <m:sty m:val="p"/>
+                        <m:nor/>
                       </m:rPr>
                       <m:t>⋆</m:t>
                     </m:r>
@@ -8656,7 +8656,7 @@
                   <m:sup>
                     <m:r>
                       <m:rPr>
-                        <m:sty m:val="p"/>
+                        <m:nor/>
                       </m:rPr>
                       <m:t>⋆</m:t>
                     </m:r>
@@ -13013,7 +13013,7 @@
           <m:sup>
             <m:r>
               <m:rPr>
-                <m:sty m:val="p"/>
+                <m:nor/>
               </m:rPr>
               <m:t>*</m:t>
             </m:r>
@@ -13080,7 +13080,7 @@
           <m:sup>
             <m:r>
               <m:rPr>
-                <m:sty m:val="p"/>
+                <m:nor/>
               </m:rPr>
               <m:t>*</m:t>
             </m:r>

</xml_diff>

<commit_message>
ASE: final blind-read fixes (reference order, base-model wording, Fig. S15 caption)
Co-Authored-By: Claude Opus 5.5 <noreply@anthropic.com>
Claude-Session: https://claude.ai/code/session_01B18ehnY6ZEjmwZNzrTta57
</commit_message>
<xml_diff>
--- a/manuscript/ase/word/Manuscript_ASE.docx
+++ b/manuscript/ase/word/Manuscript_ASE.docx
@@ -80,7 +80,7 @@
         <w:pStyle w:val="FirstParagraph"/>
       </w:pPr>
       <w:r>
-        <w:t xml:space="preserve">Influence-area weighing divides a record’s area by an integral constant, which can vanish on continuous girders because influence lines change sign. Strain gauges measuring global bending are blind at every zero of the uniform-load moment and nearly blind 0.19–0.32 of the span from the interior support on two equal spans. For position-independent noise, optimal sensors lie at the extremes of the uniform-load response; on one day of public records, weighting by vehicle-free noise raised the error 8.5 percentage points above the gauge average. For symmetric girders with equal piers the constant is linear-fractional in pier stiffness; on an in-service box girder, two static readings leave the side-span deflection constant uncertain by a factor of 6.6 against 1.5 at mid main span (base model), or 2.4 against 1.1 with girder rigidity bounded to 0.9–1.3 times design. A laboratory test is consistent with the influence-area identity. On this girder, a single deflection gauge belongs at mid main span, and a model-based side-span constant needs identified pier stiffness, for example from a pier tiltmeter.</w:t>
+        <w:t xml:space="preserve">Influence-area weighing divides a record’s area by an integral constant, which can vanish on continuous girders because influence lines change sign. Strain gauges measuring global bending are blind at every zero of the uniform-load moment and nearly blind 0.19–0.32 of the span from the interior support on two equal spans. For position-independent noise, optimal sensors lie at the extremes of the uniform-load response; on one day of public records, weighting by vehicle-free noise raised the error 8.5 percentage points above the gauge average. For symmetric girders with equal piers the constant is linear-fractional in pier stiffness; on an in-service box girder, two static readings leave the side-span deflection constant of the base model uncertain by a factor of 6.6 against 1.5 at mid main span, or 2.4 against 1.1 with girder rigidity bounded to 0.9–1.3 times design. A laboratory test is consistent with the influence-area identity. On this girder, a single deflection gauge belongs at mid main span, and a model-based side-span constant needs identified pier stiffness, for example from a pier tiltmeter.</w:t>
       </w:r>
     </w:p>
     <w:p>
@@ -132,7 +132,7 @@
         <w:pStyle w:val="BodyText"/>
       </w:pPr>
       <w:r>
-        <w:t xml:space="preserve">The identity behind these methods is classical: the area under an influence line equals the response to a uniform unit load, as design codes use for distributed lane loads (Ghali et al., 2017). On continuous girders, however, the influence line changes sign over each interior support, and positive and negative areas partly cancel. Continuous bridges have been weighed from distributed fiber-optic strain (Chaudhary et al., 2025), with lane-specific influence lines (Wu et al., 2020) and from deck strain on long-span box girders (Moghadam et al., 2022, 2023a, 2023b); Deng et al. (2025) replaced the small net area of a multi-span displacement influence line by its absolute area. Sensor placement for BWIM has been posed through an augmented Kalman filter (Zhou et al., 2025). Deflection-based load identification has been posed as a regularized stochastic problem (Zhang et al., 2026). Deflection influence lines have been identified from moving-vehicle records (Wang et al., 2026) and inverted for girder stiffness (Zhou et al., 2026), and influence lines have been used to estimate the boundary spring stiffness of a suspension-bridge girder (Lin et al., 2023). Strain-history areas along continuous girders have served damage identification (Hong et al., 2016; Wu et al., 2018), and BWIM has been applied to a two-span continuous bridge (Yamaguchi et al., 2009). Single-channel SLM assumes that the integral constant is well away from zero and independent of the boundary conditions, yet none of these studies reads the zeros of the integral constant as blind loci for weighing, or shows how they shift with uncertain boundary conditions. Such conditions are needed to choose, before installation, the few channels that screen continuous bridges for overloads.</w:t>
+        <w:t xml:space="preserve">The identity behind these methods is classical: the area under an influence line equals the response to a uniform unit load, as design codes use for distributed lane loads (Ghali et al., 2017). On continuous girders, however, the influence line changes sign over each interior support, and positive and negative areas partly cancel. Continuous bridges have been weighed from distributed fiber-optic strain (Chaudhary et al., 2025), with lane-specific influence lines (Wu et al., 2020) and from deck strain on long-span box girders (Moghadam et al., 2022, 2023a, 2023b); Deng et al. (2025) replaced the small net area of a multi-span displacement influence line by its absolute area. Sensor placement for BWIM has been posed through an augmented Kalman filter (Zhou et al., 2025). Deflection-based load identification has been posed as a regularized stochastic problem (Zhang et al., 2026). Deflection influence lines have been identified from moving-vehicle records (Wang et al., 2026) and inverted for girder stiffness (Zhou et al., 2026), and influence lines have been used to estimate the boundary spring stiffness of a suspension-bridge girder (Lin et al., 2023). Strain-history areas along continuous girders have served damage identification (Hong et al., 2016; Wu et al., 2018), and BWIM has been applied to a two-span continuous bridge (Yamaguchi et al., 2009). Single-channel SLM assumes that the integral constant is well away from zero and independent of the boundary conditions, yet none of these studies reads the zeros of the integral constant as blind loci for weighing, or shows how they shift with uncertain boundary conditions. Such criteria are needed to choose, before installation, the few channels that screen continuous bridges for overloads.</w:t>
       </w:r>
     </w:p>
     <w:p>
@@ -140,7 +140,7 @@
         <w:pStyle w:val="BodyText"/>
       </w:pPr>
       <w:r>
-        <w:t xml:space="preserve">This paper supplies such criteria. Neither the influence-area identity nor the generalized least-squares (GLS) estimator is new; the contributions lie in the criteria built on them. (i) A closed-form catalog gives the blind and near-blind loci of five channel types on prismatic two- and three-span girders; its strain criterion, the zeros of the uniform-load moment, holds for any girder in beam theory and, unlike the absolute area of Deng et al. (2025), keeps the estimate linear in the axle loads (Supplementary Section S3). (ii) Extreme-point optimal design (Elfving, 1952; Pukelsheim, 2006) gives a closed-form placement rule for the gross weight, whereas Zhou et al. (2025) optimized sensors numerically for axle-force histories: for position-independent noise, optimal sensors lie at the extremes of the uniform-load response; the rule itself is not tested in the field. On one day of public records, GLS weights from vehicle-free noise did worse than the gauge average (Section 4.3). (iii) For a symmetric girder with equal piers, the constant depends on pier stiffness through a linear-fractional (Möbius) law, a consequence of the Sherman–Morrison formula (Sherman and Morrison, 1950), and on an in-service box girder two static readings leave the constant of a side-span deflection gauge uncertain by a factor of 6.6 against 1.5 for the main-span constant from the static data alone (base model), and 2.4 against 1.1 with girder rigidity bounded to 0.9–1.3 times design (Section 5.2). The laboratory test checks the identity, the public records check its assumptions and noise model (not weighing accuracy), and the in-service girder illustrates the limits of identifiability. The blind loci are verified analytically and by finite element (FE) evaluation, not experimentally, and the blind configuration of the laboratory beam (spans of 2500 mm and 3644 mm) was not tested.</w:t>
+        <w:t xml:space="preserve">This paper supplies such criteria. Neither the influence-area identity nor the generalized least-squares (GLS) estimator is new; the contributions lie in the criteria built on them. (i) A closed-form catalog gives the blind and near-blind loci of five channel types on prismatic two- and three-span girders; its strain criterion, the zeros of the uniform-load moment, holds for any girder in beam theory and, unlike the absolute area of Deng et al. (2025), keeps the estimate linear in the axle loads (Supplementary Section S3). (ii) Extreme-point optimal design (Elfving, 1952; Pukelsheim, 2006) gives a closed-form placement rule for the gross weight: for position-independent noise, optimal sensors lie at the extremes of the uniform-load response, whereas Zhou et al. (2025) optimized sensors numerically for axle-force histories; the rule itself is not tested in the field. On one day of public records, GLS weights from vehicle-free noise did worse than the gauge average (Section 4.3). (iii) For a symmetric girder with equal piers, the constant depends on pier stiffness through a linear-fractional (Möbius) law, a consequence of the Sherman–Morrison formula (Sherman and Morrison, 1950), and on an in-service box girder two static readings leave the base-model constant of a side-span deflection gauge uncertain by a factor of 6.6 against 1.5 for the main-span constant from the static data alone, and 2.4 against 1.1 with girder rigidity bounded to 0.9–1.3 times design (Section 5.2). The laboratory test checks the identity, the public records check its assumptions and noise model (not weighing accuracy), and the in-service girder illustrates the limits of identifiability. The blind loci are verified analytically and by finite element (FE) evaluation, not experimentally, and the blind configuration of the laboratory beam (spans of 2500 mm and 3644 mm) was not tested.</w:t>
       </w:r>
     </w:p>
     <w:p>
@@ -12069,7 +12069,7 @@
         </m:r>
       </m:oMath>
       <w:r>
-        <w:t xml:space="preserve">), 2.40 m deep at mid-span and 5.40 m at the piers. The inner piers, including T7, are monolithic with the girder; the end supports T5 and T8 carry pot bearings. In the June 2020 acceptance test, 3-axle trucks with a mean weighed gross weight of 25.06 t stood in the side and main spans, and dial gauges read the peak deflection at N8, in the side span at 0.4</w:t>
+        <w:t xml:space="preserve">), 2.40 m deep at mid-span and 5.40 m at the piers. The inner piers T6 and T7 are monolithic with the girder; the end supports T5 and T8 carry pot bearings. In the June 2020 acceptance test, 3-axle trucks with a mean weighed gross weight of 25.06 t stood in the side and main spans, and dial gauges read the peak deflection at N8, in the side span at 0.4</w:t>
       </w:r>
       <m:oMath>
         <m:r>
@@ -12862,7 +12862,7 @@
         <w:t xml:space="preserve"> </w:t>
       </w:r>
       <w:r>
-        <w:t xml:space="preserve">is an effective parameter (Section 5.1). The factor is carried by</w:t>
+        <w:t xml:space="preserve">is an effective parameter (Section 5.1). The factor is carried by the N8 constant</w:t>
       </w:r>
       <w:r>
         <w:t xml:space="preserve"> </w:t>
@@ -15323,7 +15323,7 @@
         <w:pStyle w:val="BodyText"/>
       </w:pPr>
       <w:r>
-        <w:t xml:space="preserve">For a symmetric girder with equal piers, the constant is a linear-fractional (Möbius) function of the scaled pier stiffness. On a 55 + 90 + 55 m box girder, two static readings leave the side-span deflection constant uncertain by a factor of 6.6 against 1.5 for the main-span constant in the base model, or 2.4 against 1.1 with girder rigidity bounded to 0.9–1.3 times design; at the design pier stiffness a pier tiltmeter would reduce the Cramér–Rao bound on the standard deviation of</w:t>
+        <w:t xml:space="preserve">For a symmetric girder with equal piers, the constant is a linear-fractional (Möbius) function of the scaled pier stiffness. On a 55 + 90 + 55 m box girder, two static readings leave the side-span deflection constant of the base model uncertain by a factor of 6.6 against 1.5 for the main-span constant, or 2.4 against 1.1 with girder rigidity bounded to 0.9–1.3 times design; at the design pier stiffness a pier tiltmeter would reduce the Cramér–Rao bound on the standard deviation of</w:t>
       </w:r>
       <w:r>
         <w:t xml:space="preserve"> </w:t>
@@ -16371,6 +16371,29 @@
         <w:jc w:val="left"/>
       </w:pPr>
       <w:r>
+        <w:t xml:space="preserve">Pukelsheim F (2006)</w:t>
+      </w:r>
+      <w:r>
+        <w:t xml:space="preserve"> </w:t>
+      </w:r>
+      <w:r>
+        <w:rPr>
+          <w:iCs/>
+          <w:i/>
+        </w:rPr>
+        <w:t xml:space="preserve">Optimal Design of Experiments</w:t>
+      </w:r>
+      <w:r>
+        <w:t xml:space="preserve">. Philadelphia: SIAM. DOI: 10.1137/1.9780898719109.</w:t>
+      </w:r>
+    </w:p>
+    <w:p>
+      <w:pPr>
+        <w:pStyle w:val="BodyText"/>
+        <w:ind w:left="425" w:hanging="425"/>
+        <w:jc w:val="left"/>
+      </w:pPr>
+      <w:r>
         <w:t xml:space="preserve">Sherman J and Morrison WJ (1950) Adjustment of an inverse matrix corresponding to a change in one element of a given matrix.</w:t>
       </w:r>
       <w:r>
@@ -16388,29 +16411,6 @@
       </w:r>
       <w:r>
         <w:t xml:space="preserve">21(1): 124–127. DOI: 10.1214/aoms/1177729893.</w:t>
-      </w:r>
-    </w:p>
-    <w:p>
-      <w:pPr>
-        <w:pStyle w:val="BodyText"/>
-        <w:ind w:left="425" w:hanging="425"/>
-        <w:jc w:val="left"/>
-      </w:pPr>
-      <w:r>
-        <w:t xml:space="preserve">Pukelsheim F (2006)</w:t>
-      </w:r>
-      <w:r>
-        <w:t xml:space="preserve"> </w:t>
-      </w:r>
-      <w:r>
-        <w:rPr>
-          <w:iCs/>
-          <w:i/>
-        </w:rPr>
-        <w:t xml:space="preserve">Optimal Design of Experiments</w:t>
-      </w:r>
-      <w:r>
-        <w:t xml:space="preserve">. Philadelphia: SIAM. DOI: 10.1137/1.9780898719109.</w:t>
       </w:r>
     </w:p>
     <w:p>

</xml_diff>

<commit_message>
ASE: targeted readability edits (definitions before use, meaning-first 2.2 and 5.2, define the 6.6 factor, less number repetition)
Co-Authored-By: Claude Opus 5.5 <noreply@anthropic.com>
Claude-Session: https://claude.ai/code/session_01B18ehnY6ZEjmwZNzrTta57
</commit_message>
<xml_diff>
--- a/manuscript/ase/word/Manuscript_ASE.docx
+++ b/manuscript/ase/word/Manuscript_ASE.docx
@@ -80,7 +80,7 @@
         <w:pStyle w:val="FirstParagraph"/>
       </w:pPr>
       <w:r>
-        <w:t xml:space="preserve">Influence-area weighing divides a record’s area by an integral constant, which can vanish on continuous girders because influence lines change sign. Strain gauges measuring global bending are blind at every zero of the uniform-load moment and nearly blind 0.19–0.32 of the span from the interior support on two equal spans. For position-independent noise, optimal sensors lie at the extremes of the uniform-load response; on one day of public records, weighting by vehicle-free noise raised the error 8.5 percentage points above the gauge average. For symmetric girders with equal piers the constant is linear-fractional in pier stiffness; on an in-service box girder, two static readings leave the side-span deflection constant of the base model uncertain by a factor of 6.6 against 1.5 at mid main span, or 2.4 against 1.1 with girder rigidity bounded to 0.9–1.3 times design. A laboratory test is consistent with the influence-area identity. On this girder, a single deflection gauge belongs at mid main span, and a model-based side-span constant needs identified pier stiffness, for example from a pier tiltmeter.</w:t>
+        <w:t xml:space="preserve">Influence-area weighing divides a record’s area by an integral constant, which can vanish on continuous girders because influence lines change sign. Strain gauges measuring global bending are blind at every zero of the uniform-load moment and nearly blind 0.19–0.32 of the span from the interior support on two equal spans. For position-independent noise, optimal sensors lie at the extremes of the uniform-load response; on one day of public records, weighting by vehicle-free noise raised the error 8.5 percentage points above the gauge average. For symmetric girders with equal piers the constant is linear-fractional in pier stiffness; on an in-service box girder, two static readings leave the side-span deflection constant of the base model uncertain by a factor of 6.6 (largest to smallest admissible value) against 1.5 at mid main span, or 2.4 against 1.1 with girder rigidity bounded to 0.9–1.3 times design. A laboratory test is consistent with the influence-area identity. On this girder, a single deflection gauge belongs at mid main span, and a model-based side-span constant needs identified pier stiffness, for example from a pier tiltmeter.</w:t>
       </w:r>
     </w:p>
     <w:p>
@@ -140,7 +140,7 @@
         <w:pStyle w:val="BodyText"/>
       </w:pPr>
       <w:r>
-        <w:t xml:space="preserve">This paper supplies such criteria. Neither the influence-area identity nor the generalized least-squares (GLS) estimator is new; the contributions lie in the criteria built on them. (i) A closed-form catalog gives the blind and near-blind loci of five channel types on prismatic two- and three-span girders; its strain criterion, the zeros of the uniform-load moment, holds for any girder in beam theory and, unlike the absolute area of Deng et al. (2025), keeps the estimate linear in the axle loads (Supplementary Section S3). (ii) Extreme-point optimal design (Elfving, 1952; Pukelsheim, 2006) gives a closed-form placement rule for the gross weight: for position-independent noise, optimal sensors lie at the extremes of the uniform-load response, whereas Zhou et al. (2025) optimized sensors numerically for axle-force histories; the rule itself is not tested in the field. On one day of public records, GLS weights from vehicle-free noise did worse than the gauge average (Section 4.3). (iii) For a symmetric girder with equal piers, the constant depends on pier stiffness through a linear-fractional (Möbius) law, a consequence of the Sherman–Morrison formula (Sherman and Morrison, 1950), and on an in-service box girder two static readings leave the base-model constant of a side-span deflection gauge uncertain by a factor of 6.6 against 1.5 for the main-span constant from the static data alone, and 2.4 against 1.1 with girder rigidity bounded to 0.9–1.3 times design (Section 5.2). The laboratory test checks the identity, the public records check its assumptions and noise model (not weighing accuracy), and the in-service girder illustrates the limits of identifiability. The blind loci are verified analytically and by finite element (FE) evaluation, not experimentally, and the blind configuration of the laboratory beam (spans of 2500 mm and 3644 mm) was not tested.</w:t>
+        <w:t xml:space="preserve">This paper supplies such criteria. Neither the influence-area identity nor the generalized least-squares (GLS) estimator is new; the contributions lie in the criteria built on them. (i) A closed-form catalog gives the blind and near-blind loci of five channel types on prismatic two- and three-span girders; its strain criterion, the zeros of the uniform-load moment, holds for any girder in beam theory and, unlike the absolute area of Deng et al. (2025), keeps the estimate linear in the axle loads (Supplementary Section S3). (ii) Extreme-point optimal design (Elfving, 1952; Pukelsheim, 2006) gives a closed-form placement rule for the gross weight: for position-independent noise, optimal sensors lie at the extremes of the uniform-load response, whereas Zhou et al. (2025) optimized sensors numerically for axle-force histories; the rule itself is not tested in the field. On one day of public records, GLS weights from vehicle-free noise did worse than the gauge average (Section 4.3). (iii) For a symmetric girder with equal piers, the constant depends on pier stiffness through a linear-fractional (Möbius) law, a consequence of the Sherman–Morrison formula (Sherman and Morrison, 1950); on an in-service box girder, two static readings leave a side-span deflection constant several times more uncertain than the main-span constant (Section 5.2). The laboratory test checks the identity, the public records check its assumptions and noise model (not weighing accuracy), and the in-service girder illustrates the limits of identifiability. The blind loci are verified analytically and by finite element (FE) evaluation, not experimentally, and the blind configuration of the laboratory beam (spans of 2500 mm and 3644 mm) was not tested.</w:t>
       </w:r>
     </w:p>
     <w:p>
@@ -2453,7 +2453,21 @@
         <w:pStyle w:val="FirstParagraph"/>
       </w:pPr>
       <w:r>
-        <w:t xml:space="preserve">For a prismatic span under a uniform load, every channel is determined by the two end moments, written as</w:t>
+        <w:t xml:space="preserve">A channel is blind where its constant</w:t>
+      </w:r>
+      <w:r>
+        <w:t xml:space="preserve"> </w:t>
+      </w:r>
+      <m:oMath>
+        <m:r>
+          <m:t>C</m:t>
+        </m:r>
+      </m:oMath>
+      <w:r>
+        <w:t xml:space="preserve"> </w:t>
+      </w:r>
+      <w:r>
+        <w:t xml:space="preserve">vanishes and near-blind where its normalized indicator (Section 2.3) is below 0.2 in magnitude. For a prismatic span under a uniform load, every channel is determined by the two end moments, written as</w:t>
       </w:r>
       <w:r>
         <w:t xml:space="preserve"> </w:t>
@@ -3942,7 +3956,10 @@
         </m:sSub>
       </m:oMath>
       <w:r>
-        <w:t xml:space="preserve">, defined in Eq. (8) of Section 2.3. Setting</w:t>
+        <w:t xml:space="preserve"> </w:t>
+      </w:r>
+      <w:r>
+        <w:t xml:space="preserve">of Eq. (8). Setting</w:t>
       </w:r>
       <w:r>
         <w:t xml:space="preserve"> </w:t>
@@ -4199,36 +4216,24 @@
         <w:pStyle w:val="BodyText"/>
       </w:pPr>
       <w:r>
-        <w:t xml:space="preserve">In an end span, a deflection blind point therefore exists only for</w:t>
-      </w:r>
-      <w:r>
-        <w:t xml:space="preserve"> </w:t>
-      </w:r>
-      <m:oMath>
-        <m:r>
-          <m:t>1</m:t>
+        <w:t xml:space="preserve">In design terms, an end-span deflection gauge is blind only if the interior support moment lies between its value for two equal spans (</w:t>
+      </w:r>
+      <m:oMath>
+        <m:r>
+          <m:t>μ</m:t>
         </m:r>
         <m:r>
           <m:rPr>
             <m:sty m:val="p"/>
           </m:rPr>
-          <m:t>&lt;</m:t>
-        </m:r>
-        <m:r>
-          <m:t>μ</m:t>
-        </m:r>
-        <m:r>
-          <m:rPr>
-            <m:sty m:val="p"/>
-          </m:rPr>
-          <m:t>&lt;</m:t>
-        </m:r>
-        <m:r>
-          <m:t>2</m:t>
-        </m:r>
-      </m:oMath>
-      <w:r>
-        <w:t xml:space="preserve">. In design terms, an end-span deflection gauge cannot be blind on a girder of equal spans and rigidities; blindness there needs a longer adjacent span (</w:t>
+          <m:t>=</m:t>
+        </m:r>
+        <m:r>
+          <m:t>1</m:t>
+        </m:r>
+      </m:oMath>
+      <w:r>
+        <w:t xml:space="preserve">) and twice that value, which needs a longer adjacent span (</w:t>
       </w:r>
       <m:oMath>
         <m:r>
@@ -4283,53 +4288,7 @@
         </m:r>
       </m:oMath>
       <w:r>
-        <w:t xml:space="preserve">) that raises the interior support moment above its value for two equal spans (</w:t>
-      </w:r>
-      <m:oMath>
-        <m:r>
-          <m:t>μ</m:t>
-        </m:r>
-        <m:r>
-          <m:rPr>
-            <m:sty m:val="p"/>
-          </m:rPr>
-          <m:t>=</m:t>
-        </m:r>
-        <m:r>
-          <m:t>1</m:t>
-        </m:r>
-      </m:oMath>
-      <w:r>
-        <w:t xml:space="preserve">) but not to twice that value. The main span of a symmetric three-span girder of uniform rigidity behaves differently: it has deflection blind points for</w:t>
-      </w:r>
-      <w:r>
-        <w:t xml:space="preserve"> </w:t>
-      </w:r>
-      <m:oMath>
-        <m:r>
-          <m:t>0.9647</m:t>
-        </m:r>
-        <m:r>
-          <m:rPr>
-            <m:sty m:val="p"/>
-          </m:rPr>
-          <m:t>≤</m:t>
-        </m:r>
-        <m:r>
-          <m:t>β</m:t>
-        </m:r>
-        <m:r>
-          <m:rPr>
-            <m:sty m:val="p"/>
-          </m:rPr>
-          <m:t>&lt;</m:t>
-        </m:r>
-        <m:r>
-          <m:t>1.2247</m:t>
-        </m:r>
-      </m:oMath>
-      <w:r>
-        <w:t xml:space="preserve">, including three equal spans, where they lie 0.276 of the span from each pier and</w:t>
+        <w:t xml:space="preserve">); on equal spans it cannot be blind. The main span of a symmetric three-span girder is the exception: with nearly equal spans it has deflection blind points, and with three equal spans</w:t>
       </w:r>
       <w:r>
         <w:t xml:space="preserve"> </w:t>
@@ -4371,53 +4330,7 @@
         <w:t xml:space="preserve"> </w:t>
       </w:r>
       <w:r>
-        <w:t xml:space="preserve">along the whole main span (Supplementary Section S2). The resulting blind span ratios, for example</w:t>
-      </w:r>
-      <w:r>
-        <w:t xml:space="preserve"> </w:t>
-      </w:r>
-      <m:oMath>
-        <m:r>
-          <m:t>λ</m:t>
-        </m:r>
-        <m:r>
-          <m:rPr>
-            <m:sty m:val="p"/>
-          </m:rPr>
-          <m:t>=</m:t>
-        </m:r>
-        <m:r>
-          <m:t>1.4574</m:t>
-        </m:r>
-      </m:oMath>
-      <w:r>
-        <w:t xml:space="preserve"> </w:t>
-      </w:r>
-      <w:r>
-        <w:t xml:space="preserve">for a mid-span gauge on two spans of equal rigidity and</w:t>
-      </w:r>
-      <w:r>
-        <w:t xml:space="preserve"> </w:t>
-      </w:r>
-      <m:oMath>
-        <m:r>
-          <m:t>β</m:t>
-        </m:r>
-        <m:r>
-          <m:rPr>
-            <m:sty m:val="p"/>
-          </m:rPr>
-          <m:t>=</m:t>
-        </m:r>
-        <m:r>
-          <m:t>1.7006</m:t>
-        </m:r>
-      </m:oMath>
-      <w:r>
-        <w:t xml:space="preserve"> </w:t>
-      </w:r>
-      <w:r>
-        <w:t xml:space="preserve">for a mid side-span gauge on a symmetric three-span beam, are listed in Table 1; their closed forms, the optimal deflection-gauge position on two equal spans and the edges of the near-blind bands are in Supplementary Section S2 (Eqs. (S1) and (S2), Tables S2 and S3). A channel is called near-blind when its indicator (Section 2.3) is below 0.2 in magnitude (Fig. 2). All closed forms agree with FE evaluations of Eq. (2) in 981 checks (Supplementary Section S3).</w:t>
+        <w:t xml:space="preserve">along the whole main span. Table 1 lists the blind span ratios (Fig. 2); Supplementary Section S2 gives their closed forms, the optimal gauge position and the near-blind bands (Eqs. (S1) and (S2), Tables S2 and S3). All closed forms agree with FE evaluations of Eq. (2) in 981 checks (Supplementary Section S3).</w:t>
       </w:r>
     </w:p>
     <w:p>
@@ -7546,57 +7459,15 @@
         <w:t xml:space="preserve"> </w:t>
       </w:r>
       <w:r>
-        <w:t xml:space="preserve">equals 1. The rotation and shear indicators (Supplementary Section S3) equal 1 for the simply supported end rotation and end shear. A common threshold of 0.2 is 8 % of the simply supported value for deflection and 20 % for strain; this threshold is a design convention. Because</w:t>
-      </w:r>
-      <w:r>
-        <w:t xml:space="preserve"> </w:t>
-      </w:r>
-      <m:oMath>
-        <m:sSub>
-          <m:e>
-            <m:r>
-              <m:t>P</m:t>
-            </m:r>
-          </m:e>
-          <m:sub>
-            <m:r>
-              <m:t>δ</m:t>
-            </m:r>
-          </m:sub>
-        </m:sSub>
-        <m:r>
-          <m:rPr>
-            <m:sty m:val="p"/>
-          </m:rPr>
-          <m:t>=</m:t>
-        </m:r>
-        <m:sSub>
-          <m:e>
-            <m:r>
-              <m:t>δ</m:t>
-            </m:r>
-          </m:e>
-          <m:sub>
-            <m:r>
-              <m:t>0</m:t>
-            </m:r>
-          </m:sub>
-        </m:sSub>
-        <m:sSub>
-          <m:e>
-            <m:r>
-              <m:t>L</m:t>
-            </m:r>
-          </m:e>
-          <m:sub>
-            <m:r>
-              <m:rPr>
-                <m:sty m:val="p"/>
-              </m:rPr>
-              <m:t>tot</m:t>
-            </m:r>
-          </m:sub>
-        </m:sSub>
+        <w:t xml:space="preserve">equals 1. The rotation and shear indicators (Supplementary Section S3) equal 1 for the simply supported end rotation and end shear. A common threshold of 0.2 is 8 % of the simply supported value for deflection and 20 % for strain; this threshold is a design convention. Because the offset-equivalent load of Eq. (10) scales as</w:t>
+      </w:r>
+      <w:r>
+        <w:t xml:space="preserve"> </w:t>
+      </w:r>
+      <m:oMath>
+        <m:r>
+          <m:t>1</m:t>
+        </m:r>
         <m:r>
           <m:rPr>
             <m:sty m:val="p"/>
@@ -7608,10 +7479,7 @@
         </m:r>
       </m:oMath>
       <w:r>
-        <w:t xml:space="preserve"> </w:t>
-      </w:r>
-      <w:r>
-        <w:t xml:space="preserve">in Eq. (10), for the same offset and record length an indicator of 0.2 multiplies the offset-equivalent load by 12.5 relative to a simply supported mid-span deflection gauge and by 5 relative to a strain gauge there. Supplementary Table S3 gives the near-blind bands for thresholds of 0.1, 0.2 and 0.3. On a non-prismatic girder</w:t>
+        <w:t xml:space="preserve">, an indicator of 0.2 multiplies it by 12.5 relative to a simply supported mid-span deflection gauge and by 5 relative to a strain gauge there. Supplementary Table S3 gives the near-blind bands for thresholds of 0.1, 0.2 and 0.3. On a non-prismatic girder</w:t>
       </w:r>
       <w:r>
         <w:t xml:space="preserve"> </w:t>
@@ -9975,7 +9843,10 @@
         </m:r>
       </m:oMath>
       <w:r>
-        <w:t xml:space="preserve">. For a mirror-symmetric girder with equal piers, the uniform load rotates the two inner piers by equal and opposite amounts (</w:t>
+        <w:t xml:space="preserve">. For a mirror-symmetric girder with equal piers, the uniform load rotates the two inner piers by equal and opposite amounts (pier rotations</w:t>
+      </w:r>
+      <w:r>
+        <w:t xml:space="preserve"> </w:t>
       </w:r>
       <m:oMath>
         <m:sSub>
@@ -10016,7 +9887,7 @@
         </m:sSub>
       </m:oMath>
       <w:r>
-        <w:t xml:space="preserve">, with the pier labels of Section 5, a mirror-symmetric deformation) and excites no other pattern of pier rotation, and the Sherman–Morrison formula gives (Supplementary Section S5)</w:t>
+        <w:t xml:space="preserve">, a mirror-symmetric deformation) and excites no other pattern of pier rotation, and the Sherman–Morrison formula gives (Supplementary Section S5)</w:t>
       </w:r>
     </w:p>
     <w:tbl>
@@ -12806,7 +12677,21 @@
         <w:pStyle w:val="FirstParagraph"/>
       </w:pPr>
       <w:r>
-        <w:t xml:space="preserve">Two static readings leave the constant of the side-span gauge N8 uncertain by a factor of 6.6 against 1.5 for the main-span constant when the effective rigidity</w:t>
+        <w:t xml:space="preserve">The admissible set contains every model whose misfit at each gauge is within</w:t>
+      </w:r>
+      <w:r>
+        <w:t xml:space="preserve"> </w:t>
+      </w:r>
+      <m:oMath>
+        <m:r>
+          <m:t>τ</m:t>
+        </m:r>
+      </m:oMath>
+      <w:r>
+        <w:t xml:space="preserve"> </w:t>
+      </w:r>
+      <w:r>
+        <w:t xml:space="preserve">= 5.3 %, two combined standard uncertainties (measurement and model form) of a section mean (Supplementary Section S8). Over this set, the largest constant of the side-span gauge N8 is 6.6 times the smallest, against 1.5 for the main-span gauge N7, when the effective rigidity</w:t>
       </w:r>
       <w:r>
         <w:t xml:space="preserve"> </w:t>
@@ -12820,21 +12705,7 @@
         <w:t xml:space="preserve"> </w:t>
       </w:r>
       <w:r>
-        <w:t xml:space="preserve">is free (tolerance</w:t>
-      </w:r>
-      <w:r>
-        <w:t xml:space="preserve"> </w:t>
-      </w:r>
-      <m:oMath>
-        <m:r>
-          <m:t>τ</m:t>
-        </m:r>
-      </m:oMath>
-      <w:r>
-        <w:t xml:space="preserve"> </w:t>
-      </w:r>
-      <w:r>
-        <w:t xml:space="preserve">= 5.3 %), and by 2.4 against 1.1 when</w:t>
+        <w:t xml:space="preserve">is free, and by 2.4 against 1.1 when</w:t>
       </w:r>
       <w:r>
         <w:t xml:space="preserve"> </w:t>
@@ -12958,7 +12829,7 @@
         <w:t xml:space="preserve"> </w:t>
       </w:r>
       <w:r>
-        <w:t xml:space="preserve">m²/kN over the admissible set defined below; its upper end needs</w:t>
+        <w:t xml:space="preserve">m²/kN; its upper end needs</w:t>
       </w:r>
       <w:r>
         <w:t xml:space="preserve"> </w:t>
@@ -13379,7 +13250,7 @@
         <w:pStyle w:val="BodyText"/>
       </w:pPr>
       <w:r>
-        <w:t xml:space="preserve">The admissible set contains every model whose misfit at each gauge is within</w:t>
+        <w:t xml:space="preserve">At</w:t>
       </w:r>
       <w:r>
         <w:t xml:space="preserve"> </w:t>
@@ -13393,7 +13264,7 @@
         <w:t xml:space="preserve"> </w:t>
       </w:r>
       <w:r>
-        <w:t xml:space="preserve">= 5.3 %, two combined standard uncertainties (measurement and model form) of a section mean (Supplementary Section S8). At this tolerance the data bound</w:t>
+        <w:t xml:space="preserve">= 5.3 % the data bound</w:t>
       </w:r>
       <w:r>
         <w:t xml:space="preserve"> </w:t>

</xml_diff>

<commit_message>
ASE: blind-read v12 fixes (rigidity ratio naming, parallel phrasing)
Co-Authored-By: Claude Opus 5.5 <noreply@anthropic.com>
Claude-Session: https://claude.ai/code/session_01B18ehnY6ZEjmwZNzrTta57
</commit_message>
<xml_diff>
--- a/manuscript/ase/word/Manuscript_ASE.docx
+++ b/manuscript/ase/word/Manuscript_ASE.docx
@@ -80,7 +80,7 @@
         <w:pStyle w:val="FirstParagraph"/>
       </w:pPr>
       <w:r>
-        <w:t xml:space="preserve">Influence-area weighing divides a record’s area by an integral constant, which can vanish on continuous girders because influence lines change sign. Strain gauges measuring global bending are blind at every zero of the uniform-load moment and nearly blind 0.19–0.32 of the span from the interior support on two equal spans. For position-independent noise, optimal sensors lie at the extremes of the uniform-load response; on one day of public records, weighting by vehicle-free noise raised the error 8.5 percentage points above the gauge average. For symmetric girders with equal piers the constant is linear-fractional in pier stiffness; on an in-service box girder, two static readings leave the side-span deflection constant of the base model uncertain by a factor of 6.6 (largest to smallest admissible value) against 1.5 at mid main span, or 2.4 against 1.1 with girder rigidity bounded to 0.9–1.3 times design. A laboratory test is consistent with the influence-area identity. On this girder, a single deflection gauge belongs at mid main span, and a model-based side-span constant needs identified pier stiffness, for example from a pier tiltmeter.</w:t>
+        <w:t xml:space="preserve">Influence-area weighing divides a record’s area by an integral constant, which can vanish on continuous girders because influence lines change sign. Strain gauges measuring global bending are blind at every zero of the uniform-load moment and nearly blind 0.19–0.32 of the span from the interior support on two equal spans. For position-independent noise, optimal sensors lie at the extremes of the uniform-load response; on one day of public records, weighting gauges by their vehicle-free noise covariance raised the error 8.5 percentage points above the gauge average. For symmetric girders with equal piers the constant is linear-fractional in pier stiffness; on an in-service box girder, two static readings leave the side-span deflection constant of the base model uncertain by a factor of 6.6 (largest to smallest admissible value) against 1.5 at mid main span, or 2.4 against 1.1 with girder rigidity bounded to 0.9–1.3 times design. A laboratory test is consistent with the influence-area identity. On this girder, a single deflection gauge belongs at mid main span, and a model-based side-span constant needs identified pier stiffness, for example from a pier tiltmeter.</w:t>
       </w:r>
     </w:p>
     <w:p>
@@ -12691,7 +12691,7 @@
         <w:t xml:space="preserve"> </w:t>
       </w:r>
       <w:r>
-        <w:t xml:space="preserve">= 5.3 %, two combined standard uncertainties (measurement and model form) of a section mean (Supplementary Section S8). Over this set, the largest constant of the side-span gauge N8 is 6.6 times the smallest, against 1.5 for the main-span gauge N7, when the effective rigidity</w:t>
+        <w:t xml:space="preserve">= 5.3 %, two combined standard uncertainties (measurement and model form) of a section mean (Supplementary Section S8). Over this set, the largest constant of the side-span gauge N8 is 6.6 times the smallest, against 1.5 for the main-span gauge N7, when the rigidity ratio</w:t>
       </w:r>
       <w:r>
         <w:t xml:space="preserve"> </w:t>
@@ -12705,7 +12705,7 @@
         <w:t xml:space="preserve"> </w:t>
       </w:r>
       <w:r>
-        <w:t xml:space="preserve">is free, and by 2.4 against 1.1 when</w:t>
+        <w:t xml:space="preserve">is free, and 2.4 against 1.1 when</w:t>
       </w:r>
       <w:r>
         <w:t xml:space="preserve"> </w:t>
@@ -13228,7 +13228,7 @@
         </m:d>
       </m:oMath>
       <w:r>
-        <w:t xml:space="preserve">: rigidity factor that best fits both readings at given</w:t>
+        <w:t xml:space="preserve">: rigidity ratio that best fits both readings at given</w:t>
       </w:r>
       <w:r>
         <w:t xml:space="preserve"> </w:t>
@@ -14733,7 +14733,7 @@
         <w:t xml:space="preserve"> </w:t>
       </w:r>
       <w:r>
-        <w:t xml:space="preserve">falls from 0.87 with the two deflections to 0.18 with the tiltmeter. The bound assumes standard uncertainties of 2.64 % per deflection and 3 % for the pier rotation (about 167 µrad under the side-span test load). Frequencies and the case of calibration B are discussed in Supplementary Section S8.</w:t>
+        <w:t xml:space="preserve">falls from 0.87 with the two deflections to 0.18 with the tiltmeter. The bound assumes standard uncertainties of 2.64 % per deflection and 3 % of the pier rotation, which is about 167 µrad under the side-span test load. Frequencies and the case of calibration B are discussed in Supplementary Section S8.</w:t>
       </w:r>
     </w:p>
     <w:p>

</xml_diff>

<commit_message>
ASE: add two JSTCE-HUCE references (Dang et al. 2023; Vu et al. 2023); trim repeated text to stay under 12 000 word-equivalents
Co-Authored-By: Claude Opus 5.5 <noreply@anthropic.com>
Claude-Session: https://claude.ai/code/session_01MSqiFEviRg6WLXKJLTnixZ
</commit_message>
<xml_diff>
--- a/manuscript/ase/word/Manuscript_ASE.docx
+++ b/manuscript/ase/word/Manuscript_ASE.docx
@@ -132,7 +132,7 @@
         <w:pStyle w:val="BodyText"/>
       </w:pPr>
       <w:r>
-        <w:t xml:space="preserve">The identity behind these methods is classical: the area under an influence line equals the response to a uniform unit load, as design codes use for distributed lane loads (Ghali et al., 2017). On continuous girders, however, the influence line changes sign over each interior support, and positive and negative areas partly cancel. Continuous bridges have been weighed from distributed fiber-optic strain (Chaudhary et al., 2025), with lane-specific influence lines (Wu et al., 2020) and from deck strain on long-span box girders (Moghadam et al., 2022, 2023a, 2023b); Deng et al. (2025) replaced the small net area of a multi-span displacement influence line by its absolute area. Sensor placement for BWIM has been posed through an augmented Kalman filter (Zhou et al., 2025). Deflection-based load identification has been posed as a regularized stochastic problem (Zhang et al., 2026). Deflection influence lines have been identified from moving-vehicle records (Wang et al., 2026) and inverted for girder stiffness (Zhou et al., 2026), and influence lines have been used to estimate the boundary spring stiffness of a suspension-bridge girder (Lin et al., 2023). Strain-history areas along continuous girders have served damage identification (Hong et al., 2016; Wu et al., 2018), and BWIM has been applied to a two-span continuous bridge (Yamaguchi et al., 2009). Single-channel SLM assumes that the integral constant is well away from zero and independent of the boundary conditions, yet none of these studies reads the zeros of the integral constant as blind loci for weighing, or shows how they shift with uncertain boundary conditions. Such criteria are needed to choose, before installation, the few channels that screen continuous bridges for overloads.</w:t>
+        <w:t xml:space="preserve">The identity behind these methods is classical: the area under an influence line equals the response to a uniform unit load, as design codes use for distributed lane loads (Ghali et al., 2017). On continuous girders, however, the influence line changes sign over each interior support, and positive and negative areas partly cancel. Continuous bridges have been weighed from distributed fiber-optic strain (Chaudhary et al., 2025), with lane-specific influence lines (Wu et al., 2020) and from deck strain on long-span box girders (Moghadam et al., 2022, 2023a, 2023b); Deng et al. (2025) replaced the small net area of a multi-span displacement influence line by its absolute area. Sensor placement for BWIM has been posed through an augmented Kalman filter (Zhou et al., 2025). Deflection-based load identification has been posed as a regularized stochastic problem (Zhang et al., 2026). Deflection influence lines have been identified from moving-vehicle records (Wang et al., 2026) and inverted for girder stiffness (Zhou et al., 2026) or for the presence and location of stiffness loss in a beam (Dang et al., 2023), and influence lines have been used to estimate the boundary spring stiffness of a suspension-bridge girder (Lin et al., 2023). Strain-history areas along continuous girders have served damage identification (Hong et al., 2016; Wu et al., 2018), and BWIM has been applied to a two-span continuous bridge (Yamaguchi et al., 2009). Single-channel SLM assumes that the integral constant is well away from zero and independent of the boundary conditions, yet none of these studies reads the zeros of the integral constant as blind loci for weighing, or shows how they shift with uncertain boundary conditions. Such criteria are needed to choose, before installation, the few channels that screen continuous bridges for overloads.</w:t>
       </w:r>
     </w:p>
     <w:p>
@@ -2240,7 +2240,7 @@
         <w:t xml:space="preserve"> </w:t>
       </w:r>
       <w:r>
-        <w:t xml:space="preserve">and any elastic supports. This is a beam-theory result for gauges that measure global bending, such as gauges on a girder flange or web; deck-soffit gauges also respond to local slab action (two nearby deck gauges differ by a factor of 3.9; Section 4.2). The beam-property method (BPM) computes</w:t>
+        <w:t xml:space="preserve">and any elastic supports. This is a beam-theory result for gauges that measure global bending, such as gauges on a girder flange or web; deck-soffit gauges also respond to local slab action (Section 4.2). The beam-property method (BPM) computes</w:t>
       </w:r>
       <w:r>
         <w:t xml:space="preserve"> </w:t>
@@ -5228,7 +5228,7 @@
         </m:r>
       </m:oMath>
       <w:r>
-        <w:t xml:space="preserve">), but one set back from the pier to clear the diaphragm can fall into the band. Table 1 collects the blind loci, and Fig. 3 shows the indicators along two prismatic girders. The end-reaction indicator</w:t>
+        <w:t xml:space="preserve">), but one set back from the pier to clear the diaphragm can fall into the band. Fig. 3 shows the indicators along two prismatic girders. The end-reaction indicator</w:t>
       </w:r>
       <w:r>
         <w:t xml:space="preserve"> </w:t>
@@ -9882,10 +9882,7 @@
         </m:r>
       </m:oMath>
       <w:r>
-        <w:t xml:space="preserve">. For a mirror-symmetric girder with equal piers, the uniform load rotates the two inner piers by equal and opposite amounts (rotations</w:t>
-      </w:r>
-      <w:r>
-        <w:t xml:space="preserve"> </w:t>
+        <w:t xml:space="preserve">. For a mirror-symmetric girder with equal piers, the uniform load rotates the two inner piers by equal and opposite amounts (</w:t>
       </w:r>
       <m:oMath>
         <m:sSub>
@@ -9926,10 +9923,7 @@
         </m:sSub>
       </m:oMath>
       <w:r>
-        <w:t xml:space="preserve"> </w:t>
-      </w:r>
-      <w:r>
-        <w:t xml:space="preserve">of the two inner piers, a mirror-symmetric deformation) and excites no other pattern of pier rotation, and the Sherman–Morrison formula gives (Supplementary Section S5)</w:t>
+        <w:t xml:space="preserve">) and excites no other pattern of pier rotation, and the Sherman–Morrison formula gives (Supplementary Section S5)</w:t>
       </w:r>
     </w:p>
     <w:tbl>
@@ -11255,7 +11249,7 @@
         <w:pStyle w:val="BodyText"/>
       </w:pPr>
       <w:r>
-        <w:t xml:space="preserve">The analytical influence line matched the single-load record within 0.0126 mm, 0.44 % of the peak. With the trapezoidal rule, BPM overestimated the weighed totals of 66.99 N and 125.08 N by 1.10 % and 1.19 %, and SLM by 0.61 % and 0.70 % (Supplementary Table S4). The BPM-to-SLM ratio equals 1.0049, the ratio of the measured reference integral to its exact value: SLM absorbs the calibration error of the reference record, whereas BPM does not. The SLM deviations follow the measured-to-analytical integral ratio (Supplementary Section S6). The test supports the invariance of Eq. (2) only indirectly.</w:t>
+        <w:t xml:space="preserve">The analytical influence line matched the single-load record within 0.0126 mm, 0.44 % of the peak. With the trapezoidal rule, BPM overestimated the weighed totals of 66.99 N and 125.08 N by 1.10 % and 1.19 %, and SLM by 0.61 % and 0.70 % (Supplementary Table S4). The BPM-to-SLM ratio equals 1.0049, the ratio of the measured reference integral to its exact value: SLM absorbs the calibration error of the reference record, whereas BPM does not (Supplementary Section S6). The test supports the invariance of Eq. (2) only indirectly.</w:t>
       </w:r>
     </w:p>
     <w:bookmarkEnd w:id="37"/>
@@ -11273,7 +11267,7 @@
         <w:pStyle w:val="FirstParagraph"/>
       </w:pPr>
       <w:r>
-        <w:t xml:space="preserve">Public records test the assumptions of the identity and the noise model of Section 2.4, with 95 % confidence intervals (CIs); further tables are in Supplementary Section S7.</w:t>
+        <w:t xml:space="preserve">Public records test the assumptions of the identity and the noise model of Section 2.4, with 95 % confidence intervals (CIs).</w:t>
       </w:r>
     </w:p>
     <w:bookmarkStart w:id="41" w:name="data-and-processing"/>
@@ -12776,21 +12770,7 @@
         <w:t xml:space="preserve"> </w:t>
       </w:r>
       <w:r>
-        <w:t xml:space="preserve">is bounded to the material range 0.9–1.3 (Table 3; Supplementary Table S13). Across the model-form variants the factors are 2.6–16 for N8 against 1.3–1.6 for N7, so the contrast holds although its size depends on the model. The two factors are scenarios, not an estimate and a correction: the bound excludes calibration B, and</w:t>
-      </w:r>
-      <w:r>
-        <w:t xml:space="preserve"> </w:t>
-      </w:r>
-      <m:oMath>
-        <m:r>
-          <m:t>α</m:t>
-        </m:r>
-      </m:oMath>
-      <w:r>
-        <w:t xml:space="preserve"> </w:t>
-      </w:r>
-      <w:r>
-        <w:t xml:space="preserve">is an effective parameter (Section 5.1). The factor of 6.6 is carried by the N8 constant</w:t>
+        <w:t xml:space="preserve">is bounded to the material range 0.9–1.3 (Table 3; Supplementary Table S13). Across the model-form variants the factors are 2.6–16 for N8 against 1.3–1.6 for N7, so the contrast holds although its size depends on the model. The two factors are scenarios, not an estimate and a correction: the bound excludes calibration B. The factor of 6.6 is carried by the N8 constant</w:t>
       </w:r>
       <w:r>
         <w:t xml:space="preserve"> </w:t>
@@ -12954,7 +12934,7 @@
         <w:t xml:space="preserve"> </w:t>
       </w:r>
       <w:r>
-        <w:t xml:space="preserve">(measured-to-model ratio at N8 divided by that at N7) has its minimum, 1.058, at calibration B (Fig. 7a), and the model-form variants move the minimum between 1.039 and 1.092 but never to 1. Calibration B is therefore the nearest fit rather than an exact one. Its</w:t>
+        <w:t xml:space="preserve">(measured-to-model ratio at N8 divided by that at N7) has its minimum, 1.058, at calibration B (Fig. 7a), and the model-form variants move the minimum between 1.039 and 1.092 but never to 1. Its</w:t>
       </w:r>
       <w:r>
         <w:t xml:space="preserve"> </w:t>
@@ -12977,7 +12957,7 @@
         <w:t xml:space="preserve"> </w:t>
       </w:r>
       <w:r>
-        <w:t xml:space="preserve">is an effective rigidity 28 % below design, which is implausible as a material loss in a recently built prestressed girder and more likely absorbs omitted mechanisms.</w:t>
+        <w:t xml:space="preserve">is an effective rigidity 28 % below design, which is implausible as a material loss in a recently built prestressed girder.</w:t>
       </w:r>
     </w:p>
     <w:p>
@@ -15035,7 +15015,7 @@
         <w:t xml:space="preserve"> </w:t>
       </w:r>
       <w:r>
-        <w:t xml:space="preserve">mm biases a 25 t truck by 16–25 % at a single main-span gauge and by 41–271 % at a single side-span gauge (Supplementary Table S17). For a residual offset of 0.1 mm, single-point influence-area weighing on this 200 m unit is therefore marginal even at the best location (other offsets: Supplementary Table S17), and non-contact techniques must establish their residual offset on site, because environmental effects act over the same window (Sohn, 2007; Cross et al., 2013). The speed estimator alone can shift the weight by more than 10 %, and dynamics add a further term (Frýba, 1999; Supplementary Sections S9 and S10). The method is therefore proposed for preliminary overload screening. Its threshold should be set with a margin below the legal limit and the design live loads (CEN, 2003; AASHTO, 2024), and flagged vehicles should be weighed by influence-line BWIM, which does not suffer the blindness of Table 1 because it fits the whole record shape.</w:t>
+        <w:t xml:space="preserve">mm biases a 25 t truck by 16–25 % at a single main-span gauge and by 41–271 % at a single side-span gauge (Supplementary Table S17). Single-point influence-area weighing on this 200 m unit is therefore marginal even at the best location, and non-contact techniques, such as terrestrial laser scanning of bridge deflection (Vu et al., 2023), must establish their residual offset on site, because environmental effects act over the same window (Sohn, 2007; Cross et al., 2013). The speed estimator alone can shift the weight by more than 10 %, and dynamics add a further term (Frýba, 1999; Supplementary Sections S9 and S10). The method is therefore proposed for preliminary overload screening. Its threshold should be set with a margin below the legal limit and the design live loads (CEN, 2003; AASHTO, 2024), and flagged vehicles should be weighed by influence-line BWIM, which does not suffer the blindness of Table 1 because it fits the whole record shape.</w:t>
       </w:r>
     </w:p>
     <w:p>
@@ -15043,7 +15023,7 @@
         <w:pStyle w:val="BodyText"/>
       </w:pPr>
       <w:r>
-        <w:t xml:space="preserve">Several limitations remain. The strain criterion holds for gauges that measure global bending, not for deck-soffit gauges (Sections 2.1 and 4.2). The laboratory beam had equal spans and statically positioned loads. The field data come from one public dataset with four trucks, nearly constant reference weights, no deflection channel and no gauge at a zero-moment point, so weight discrimination, the strain and deflection blind loci and a deflection pair could not be tested, and a screening threshold still needs field calibration with trucks of clearly different weights. The in-service analysis uses static data and a beam model with an assumed depth law and equal pier springs, and its moving-load test is designed but not performed. The treatment is one-dimensional along each lane.</w:t>
+        <w:t xml:space="preserve">Several limitations remain. The strain criterion holds for gauges that measure global bending, not for deck-soffit gauges (Sections 2.1 and 4.2). The laboratory beam had equal spans and statically positioned loads. The field data come from one public dataset with four trucks, nearly constant reference weights, no deflection channel and no gauge at a zero-moment point, so weight discrimination, the strain and deflection blind loci and a deflection pair could not be tested, and a screening threshold still needs field calibration with trucks of clearly different weights. The in-service analysis uses static data and a beam model with an assumed depth law and equal pier springs. The treatment is one-dimensional along each lane.</w:t>
       </w:r>
     </w:p>
     <w:bookmarkEnd w:id="58"/>
@@ -15657,6 +15637,32 @@
         <w:jc w:val="left"/>
       </w:pPr>
       <w:r>
+        <w:t xml:space="preserve">Dang NTV, Ho DD and Ha MT (2023) [Diagnosis of stiffness reduction in beam structures using displacement influence line data].</w:t>
+      </w:r>
+      <w:r>
+        <w:t xml:space="preserve"> </w:t>
+      </w:r>
+      <w:r>
+        <w:rPr>
+          <w:iCs/>
+          <w:i/>
+        </w:rPr>
+        <w:t xml:space="preserve">Journal of Science and Technology in Civil Engineering (HUCE)</w:t>
+      </w:r>
+      <w:r>
+        <w:t xml:space="preserve"> </w:t>
+      </w:r>
+      <w:r>
+        <w:t xml:space="preserve">17(3V): 47–65 (in Vietnamese). DOI: 10.31814/stce.huce2023-17(3V)-04.</w:t>
+      </w:r>
+    </w:p>
+    <w:p>
+      <w:pPr>
+        <w:pStyle w:val="BodyText"/>
+        <w:ind w:left="425" w:hanging="425"/>
+        <w:jc w:val="left"/>
+      </w:pPr>
+      <w:r>
         <w:t xml:space="preserve">Deng L, Liu P, Huang T and Kaewunruen S (2025) A novel moving load identification method for continuous rigid-frame bridges using a field-based displacement influence line.</w:t>
       </w:r>
       <w:r>
@@ -16407,6 +16413,32 @@
       </w:r>
       <w:r>
         <w:t xml:space="preserve">11(4): 776–796. DOI: 10.1016/j.jtte.2023.11.005.</w:t>
+      </w:r>
+    </w:p>
+    <w:p>
+      <w:pPr>
+        <w:pStyle w:val="BodyText"/>
+        <w:ind w:left="425" w:hanging="425"/>
+        <w:jc w:val="left"/>
+      </w:pPr>
+      <w:r>
+        <w:t xml:space="preserve">Vu DC, Luong ND, Cu VH, Vu NQ and Bui NS (2023) Study on the application of TLS for bridge deflection inspection in Vietnam.</w:t>
+      </w:r>
+      <w:r>
+        <w:t xml:space="preserve"> </w:t>
+      </w:r>
+      <w:r>
+        <w:rPr>
+          <w:iCs/>
+          <w:i/>
+        </w:rPr>
+        <w:t xml:space="preserve">Journal of Science and Technology in Civil Engineering (HUCE)</w:t>
+      </w:r>
+      <w:r>
+        <w:t xml:space="preserve"> </w:t>
+      </w:r>
+      <w:r>
+        <w:t xml:space="preserve">17(4): 14–25. DOI: 10.31814/stce.huce2023-17(4)-02.</w:t>
       </w:r>
     </w:p>
     <w:p>

</xml_diff>

<commit_message>
ASE: blind-read round 17 fixes
Co-Authored-By: Claude Opus 5.5 <noreply@anthropic.com>
Claude-Session: https://claude.ai/code/session_01MSqiFEviRg6WLXKJLTnixZ
</commit_message>
<xml_diff>
--- a/manuscript/ase/word/Manuscript_ASE.docx
+++ b/manuscript/ase/word/Manuscript_ASE.docx
@@ -80,7 +80,7 @@
         <w:pStyle w:val="FirstParagraph"/>
       </w:pPr>
       <w:r>
-        <w:t xml:space="preserve">Influence-area bridge weigh-in-motion divides the area under a response record by an integral constant. On continuous girders this constant can vanish, because influence lines change sign, and a gauge there cannot weigh. The paper gives three main results. First, closed forms locate these blind points for five channel types: strain gauges measuring global bending are blind at every zero of the uniform-load moment and nearly blind 0.19–0.32 of the span from the interior support on two equal spans, whereas deflection gauges are blind only for particular span ratios. Second, for position-independent noise, the best sensor locations are the extremes of the uniform-load response; on one day of public records, weighting gauges by vehicle-free noise covariance raised the error 8.5 percentage points above the gauge average. Third, for symmetric girders with equal piers the constant is linear-fractional in pier stiffness; on an in-service box girder, two static readings leave the side-span deflection constant of the base model uncertain by a factor of 6.6 against 1.5 at mid main span (2.4 against 1.1 with girder rigidity bounded to 0.9–1.3 times design). On this girder, a single deflection gauge belongs at mid main span.</w:t>
+        <w:t xml:space="preserve">Influence-area bridge weigh-in-motion divides the area under a response record by an integral constant. On continuous girders this constant can vanish, because influence lines change sign, and a gauge where it vanishes cannot weigh. The paper gives three main results. First, closed forms locate these blind points for five channel types: strain gauges measuring global bending are blind at every zero of the uniform-load moment and nearly blind 0.19–0.32 of the span from the interior support on two equal spans, whereas deflection gauges are blind only for particular span ratios. Second, for position-independent noise, the best sensor locations are the extremes of the uniform-load response; on one day of public records, weighting gauges by vehicle-free noise covariance raised the error 8.5 percentage points above the gauge average. Third, for symmetric girders with equal piers the constant is linear-fractional in pier stiffness; on an in-service box girder, two static readings leave the side-span deflection constant of the base model uncertain by a factor of 6.6 against 1.5 at mid main span (2.4 against 1.1 with girder rigidity bounded to 0.9–1.3 times design). On this girder, a single deflection gauge belongs at mid main span.</w:t>
       </w:r>
     </w:p>
     <w:p>
@@ -5228,7 +5228,7 @@
         </m:r>
       </m:oMath>
       <w:r>
-        <w:t xml:space="preserve">), but one set back from the pier to clear the diaphragm can fall into the band. Fig. 3 shows the indicators along two prismatic girders. The end-reaction indicator</w:t>
+        <w:t xml:space="preserve">), but one set back from the pier to clear the diaphragm can fall into the band. Figure 3 shows the indicators along two prismatic girders. The end-reaction indicator</w:t>
       </w:r>
       <w:r>
         <w:t xml:space="preserve"> </w:t>
@@ -12770,7 +12770,21 @@
         <w:t xml:space="preserve"> </w:t>
       </w:r>
       <w:r>
-        <w:t xml:space="preserve">is bounded to the material range 0.9–1.3 (Table 3; Supplementary Table S13). Across the model-form variants the factors are 2.6–16 for N8 against 1.3–1.6 for N7, so the contrast holds although its size depends on the model. The two factors are scenarios, not an estimate and a correction: the bound excludes calibration B. The factor of 6.6 is carried by the N8 constant</w:t>
+        <w:t xml:space="preserve">is bounded to the material range 0.9–1.3 (Table 3; Supplementary Table S13). Across the model-form variants the factors are 2.6–16 for N8 against 1.3–1.6 for N7, so the contrast holds although its size depends on the model. The two factors are scenarios, not an estimate and a correction: the bound</w:t>
+      </w:r>
+      <w:r>
+        <w:t xml:space="preserve"> </w:t>
+      </w:r>
+      <m:oMath>
+        <m:r>
+          <m:t>α</m:t>
+        </m:r>
+      </m:oMath>
+      <w:r>
+        <w:t xml:space="preserve"> </w:t>
+      </w:r>
+      <w:r>
+        <w:t xml:space="preserve">= 0.9–1.3 excludes calibration B. The factor of 6.6 is carried by the N8 constant</w:t>
       </w:r>
       <w:r>
         <w:t xml:space="preserve"> </w:t>
@@ -12934,7 +12948,7 @@
         <w:t xml:space="preserve"> </w:t>
       </w:r>
       <w:r>
-        <w:t xml:space="preserve">(measured-to-model ratio at N8 divided by that at N7) has its minimum, 1.058, at calibration B (Fig. 7a), and the model-form variants move the minimum between 1.039 and 1.092 but never to 1. Its</w:t>
+        <w:t xml:space="preserve">(measured-to-model ratio at N8 divided by that at N7) has its minimum, 1.058, at calibration B (Fig. 7a), and the model-form variants move the minimum between 1.039 and 1.092 but never to 1. The</w:t>
       </w:r>
       <w:r>
         <w:t xml:space="preserve"> </w:t>
@@ -12957,7 +12971,7 @@
         <w:t xml:space="preserve"> </w:t>
       </w:r>
       <w:r>
-        <w:t xml:space="preserve">is an effective rigidity 28 % below design, which is implausible as a material loss in a recently built prestressed girder.</w:t>
+        <w:t xml:space="preserve">of calibration B is an effective rigidity 28 % below design, which is implausible as a material loss in a recently built prestressed girder.</w:t>
       </w:r>
     </w:p>
     <w:p>
@@ -14775,7 +14789,7 @@
         <w:t xml:space="preserve"> </w:t>
       </w:r>
       <w:r>
-        <w:t xml:space="preserve">falls from 0.87 with the two deflections to 0.18 with the tiltmeter. The bound assumes standard uncertainties of 2.64 % per deflection and 3 % of the pier rotation; the rotation itself is about 167 µrad under the side-span test load. Frequencies and the case of calibration B are discussed in Supplementary Section S8.</w:t>
+        <w:t xml:space="preserve">falls from 0.87 with the two deflections to 0.18 with the tiltmeter. The bound assumes standard uncertainties of 2.64 % per deflection and 3 % of the pier rotation; the rotation itself is about 167 µrad under the side-span test load.</w:t>
       </w:r>
     </w:p>
     <w:p>

</xml_diff>

<commit_message>
Blind-read round 20 fixes: Acknowledgments, conflicting interests; upload list
Co-Authored-By: Claude Opus 5.5 <noreply@anthropic.com>
Claude-Session: https://claude.ai/code/session_01MSqiFEviRg6WLXKJLTnixZ
</commit_message>
<xml_diff>
--- a/manuscript/ase/word/Manuscript_ASE.docx
+++ b/manuscript/ase/word/Manuscript_ASE.docx
@@ -15321,13 +15321,13 @@
       </w:r>
     </w:p>
     <w:bookmarkEnd w:id="59"/>
-    <w:bookmarkStart w:id="60" w:name="acknowledgements"/>
+    <w:bookmarkStart w:id="60" w:name="acknowledgments"/>
     <w:p>
       <w:pPr>
         <w:pStyle w:val="Heading2"/>
       </w:pPr>
       <w:r>
-        <w:t xml:space="preserve">Acknowledgements</w:t>
+        <w:t xml:space="preserve">Acknowledgments</w:t>
       </w:r>
     </w:p>
     <w:p>
@@ -15428,13 +15428,13 @@
       </w:r>
     </w:p>
     <w:bookmarkEnd w:id="64"/>
-    <w:bookmarkStart w:id="65" w:name="declaration-of-conflicting-interest"/>
+    <w:bookmarkStart w:id="65" w:name="declaration-of-conflicting-interests"/>
     <w:p>
       <w:pPr>
         <w:pStyle w:val="Heading3"/>
       </w:pPr>
       <w:r>
-        <w:t xml:space="preserve">Declaration of conflicting interest</w:t>
+        <w:t xml:space="preserve">Declaration of conflicting interests</w:t>
       </w:r>
     </w:p>
     <w:p>

</xml_diff>